<commit_message>
Actualizacion de documentos #7
</commit_message>
<xml_diff>
--- a/FD01-EPIS-Informe de Factibilidad.docx
+++ b/FD01-EPIS-Informe de Factibilidad.docx
@@ -1819,7 +1819,7 @@
     </w:p>
     <w:sdt>
       <w:sdtPr>
-        <w:id w:val="-1218169442"/>
+        <w:id w:val="-785171922"/>
         <w:docPartObj>
           <w:docPartGallery w:val="Table of Contents"/>
           <w:docPartUnique w:val="1"/>
@@ -3572,7 +3572,7 @@
           <w:szCs w:val="24"/>
           <w:rtl w:val="0"/>
         </w:rPr>
-        <w:t xml:space="preserve">El proyecto consiste en el diseño y desarrollo de una plataforma web de acceso abierto orientada a centralizar y simplificar el acceso a la información bibliográfica. El sistema funciona como un motor de búsqueda híbrido que permite a los usuarios realizar consultas simultáneas en dos entornos: el inventario físico local de la facultad y el ecosistema digital global. La solución optimiza la investigación académica al proporcionar, en una sola interfaz, la disponibilidad de textos en estanterías y enlaces directos a recursos bibliográficos en formato PDF alojados en repositorios validados. El sistema se basa en una arquitectura de servicios distribuidos que integra la Google Books API para el enriquecimiento de metadatos en tiempo real. Para su implementación, se utiliza el lenguaje PHP 8.2.12 y MySQL para la persistencia de datos, empleando Terraform para la gestión de infraestructura como código (IaC) sobre Microsoft Azure.</w:t>
+        <w:t xml:space="preserve">El proyecto consiste en el diseño y desarrollo de una plataforma web de acceso unificado orientada a centralizar y simplificar el descubrimiento de recursos bibliográficos para la comunidad académica de la Universidad Privada de Tacna. El sistema funciona como un meta-buscador híbrido que integra tres pilares estratégicos: la base de datos local de la biblioteca física de la UPT, el catálogo digital especializado de Alpha Cloud y la extensa colección académica de E-Libro, lo que permite una cobertura mucho más amplia y categorizada.  La solución optimiza la investigación académica al proporcionar, en una sola interfaz, la consulta simultánea de la disponibilidad de textos en estanterías físicas y el acceso directo a recursos electrónicos validados de alta calidad. El sistema se basa en una arquitectura de servicios distribuidos que orquesta la recuperación de metadatos desde repositorios institucionales y externos para ofrecer un catálogo enriquecido. Para su implementación, se utiliza el lenguaje PHP 8.2.12 y MySQL para la persistencia de datos , empleando Terraform para la gestión de infraestructura como código (IaC) sobre Microsoft Azure.</w:t>
       </w:r>
     </w:p>
     <w:p>
@@ -3619,6 +3619,526 @@
           <w:rtl w:val="0"/>
         </w:rPr>
         <w:t xml:space="preserve">1.4.1. Objetivo general</w:t>
+      </w:r>
+    </w:p>
+    <w:p>
+      <w:pPr>
+        <w:numPr>
+          <w:ilvl w:val="0"/>
+          <w:numId w:val="3"/>
+        </w:numPr>
+        <w:spacing w:after="0" w:line="360" w:lineRule="auto"/>
+        <w:ind w:left="1080" w:hanging="360"/>
+        <w:jc w:val="both"/>
+        <w:rPr>
+          <w:rFonts w:ascii="Times New Roman" w:cs="Times New Roman" w:eastAsia="Times New Roman" w:hAnsi="Times New Roman"/>
+          <w:sz w:val="24"/>
+          <w:szCs w:val="24"/>
+        </w:rPr>
+      </w:pPr>
+      <w:r>
+        <w:rPr>
+          <w:rFonts w:ascii="Times New Roman" w:cs="Times New Roman" w:eastAsia="Times New Roman" w:hAnsi="Times New Roman"/>
+          <w:sz w:val="24"/>
+          <w:szCs w:val="24"/>
+          <w:rtl w:val="0"/>
+        </w:rPr>
+        <w:t xml:space="preserve">Desarrollar una plataforma web unificada que optimice la localización y el acceso a recursos bibliográficos físicos y digitales, mejorando la experiencia de búsqueda y la gestión de información para la comunidad académica.</w:t>
+      </w:r>
+    </w:p>
+    <w:p>
+      <w:pPr>
+        <w:pStyle w:val="Heading3"/>
+        <w:spacing w:after="0" w:before="0" w:line="360" w:lineRule="auto"/>
+        <w:jc w:val="both"/>
+        <w:rPr>
+          <w:rFonts w:ascii="Times New Roman" w:cs="Times New Roman" w:eastAsia="Times New Roman" w:hAnsi="Times New Roman"/>
+          <w:sz w:val="24"/>
+          <w:szCs w:val="24"/>
+        </w:rPr>
+      </w:pPr>
+      <w:bookmarkStart w:colFirst="0" w:colLast="0" w:name="_heading=h.qloqizxbkk1a" w:id="8"/>
+      <w:bookmarkEnd w:id="8"/>
+      <w:r>
+        <w:rPr>
+          <w:rFonts w:ascii="Times New Roman" w:cs="Times New Roman" w:eastAsia="Times New Roman" w:hAnsi="Times New Roman"/>
+          <w:sz w:val="24"/>
+          <w:szCs w:val="24"/>
+          <w:rtl w:val="0"/>
+        </w:rPr>
+        <w:t xml:space="preserve">1.4.2 Objetivos específicos</w:t>
+      </w:r>
+    </w:p>
+    <w:p>
+      <w:pPr>
+        <w:numPr>
+          <w:ilvl w:val="0"/>
+          <w:numId w:val="6"/>
+        </w:numPr>
+        <w:spacing w:after="0" w:line="360" w:lineRule="auto"/>
+        <w:ind w:left="1080" w:hanging="360"/>
+        <w:jc w:val="both"/>
+        <w:rPr>
+          <w:rFonts w:ascii="Times New Roman" w:cs="Times New Roman" w:eastAsia="Times New Roman" w:hAnsi="Times New Roman"/>
+          <w:sz w:val="24"/>
+          <w:szCs w:val="24"/>
+        </w:rPr>
+      </w:pPr>
+      <w:r>
+        <w:rPr>
+          <w:rFonts w:ascii="Times New Roman" w:cs="Times New Roman" w:eastAsia="Times New Roman" w:hAnsi="Times New Roman"/>
+          <w:sz w:val="24"/>
+          <w:szCs w:val="24"/>
+          <w:rtl w:val="0"/>
+        </w:rPr>
+        <w:t xml:space="preserve">Diseñar e implementar un sistema de búsqueda multicanal que permita filtrar resultados por título, autor y categoría, unificando la consulta de recursos físicos y virtuales en una sola interfaz.  </w:t>
+      </w:r>
+    </w:p>
+    <w:p>
+      <w:pPr>
+        <w:numPr>
+          <w:ilvl w:val="0"/>
+          <w:numId w:val="6"/>
+        </w:numPr>
+        <w:spacing w:after="0" w:line="360" w:lineRule="auto"/>
+        <w:ind w:left="1080" w:hanging="360"/>
+        <w:jc w:val="both"/>
+        <w:rPr>
+          <w:rFonts w:ascii="Times New Roman" w:cs="Times New Roman" w:eastAsia="Times New Roman" w:hAnsi="Times New Roman"/>
+          <w:sz w:val="24"/>
+          <w:szCs w:val="24"/>
+        </w:rPr>
+      </w:pPr>
+      <w:r>
+        <w:rPr>
+          <w:rFonts w:ascii="Times New Roman" w:cs="Times New Roman" w:eastAsia="Times New Roman" w:hAnsi="Times New Roman"/>
+          <w:sz w:val="24"/>
+          <w:szCs w:val="24"/>
+          <w:rtl w:val="0"/>
+        </w:rPr>
+        <w:t xml:space="preserve">Integrar la base de datos local de la biblioteca de la UPT para permitir a los usuarios visualizar la disponibilidad de los textos físicos en estantería en tiempo real.  </w:t>
+      </w:r>
+    </w:p>
+    <w:p>
+      <w:pPr>
+        <w:numPr>
+          <w:ilvl w:val="0"/>
+          <w:numId w:val="6"/>
+        </w:numPr>
+        <w:spacing w:after="0" w:line="360" w:lineRule="auto"/>
+        <w:ind w:left="1080" w:hanging="360"/>
+        <w:jc w:val="both"/>
+        <w:rPr>
+          <w:rFonts w:ascii="Times New Roman" w:cs="Times New Roman" w:eastAsia="Times New Roman" w:hAnsi="Times New Roman"/>
+          <w:sz w:val="24"/>
+          <w:szCs w:val="24"/>
+        </w:rPr>
+      </w:pPr>
+      <w:r>
+        <w:rPr>
+          <w:rFonts w:ascii="Times New Roman" w:cs="Times New Roman" w:eastAsia="Times New Roman" w:hAnsi="Times New Roman"/>
+          <w:sz w:val="24"/>
+          <w:szCs w:val="24"/>
+          <w:rtl w:val="0"/>
+        </w:rPr>
+        <w:t xml:space="preserve">Vincular los catálogos digitales de Alpha Cloud y E-Libro para expandir significativamente la oferta bibliográfica y garantizar el acceso a una mayor variedad de categorías académicas.  </w:t>
+      </w:r>
+    </w:p>
+    <w:p>
+      <w:pPr>
+        <w:numPr>
+          <w:ilvl w:val="0"/>
+          <w:numId w:val="6"/>
+        </w:numPr>
+        <w:spacing w:after="0" w:line="360" w:lineRule="auto"/>
+        <w:ind w:left="1080" w:hanging="360"/>
+        <w:jc w:val="both"/>
+        <w:rPr>
+          <w:rFonts w:ascii="Times New Roman" w:cs="Times New Roman" w:eastAsia="Times New Roman" w:hAnsi="Times New Roman"/>
+          <w:sz w:val="24"/>
+          <w:szCs w:val="24"/>
+        </w:rPr>
+      </w:pPr>
+      <w:r>
+        <w:rPr>
+          <w:rFonts w:ascii="Times New Roman" w:cs="Times New Roman" w:eastAsia="Times New Roman" w:hAnsi="Times New Roman"/>
+          <w:sz w:val="24"/>
+          <w:szCs w:val="24"/>
+          <w:rtl w:val="0"/>
+        </w:rPr>
+        <w:t xml:space="preserve">Configurar la infraestructura como código (IaC) mediante Terraform para automatizar el despliegue de los servicios en Microsoft Azure y gestionar con precisión los costos operativos.  </w:t>
+      </w:r>
+    </w:p>
+    <w:p>
+      <w:pPr>
+        <w:numPr>
+          <w:ilvl w:val="0"/>
+          <w:numId w:val="6"/>
+        </w:numPr>
+        <w:spacing w:after="0" w:line="360" w:lineRule="auto"/>
+        <w:ind w:left="1080" w:hanging="360"/>
+        <w:jc w:val="both"/>
+        <w:rPr>
+          <w:rFonts w:ascii="Times New Roman" w:cs="Times New Roman" w:eastAsia="Times New Roman" w:hAnsi="Times New Roman"/>
+          <w:sz w:val="24"/>
+          <w:szCs w:val="24"/>
+        </w:rPr>
+      </w:pPr>
+      <w:r>
+        <w:rPr>
+          <w:rFonts w:ascii="Times New Roman" w:cs="Times New Roman" w:eastAsia="Times New Roman" w:hAnsi="Times New Roman"/>
+          <w:sz w:val="24"/>
+          <w:szCs w:val="24"/>
+          <w:rtl w:val="0"/>
+        </w:rPr>
+        <w:t xml:space="preserve">Garantizar la escalabilidad de la arquitectura, facilitando la futura incorporación de bases de datos de otras facultades o repositorios institucionales adicionales. </w:t>
+      </w:r>
+    </w:p>
+    <w:p>
+      <w:pPr>
+        <w:pStyle w:val="Heading1"/>
+        <w:spacing w:before="0" w:line="360" w:lineRule="auto"/>
+        <w:jc w:val="both"/>
+        <w:rPr>
+          <w:rFonts w:ascii="Times New Roman" w:cs="Times New Roman" w:eastAsia="Times New Roman" w:hAnsi="Times New Roman"/>
+          <w:b w:val="1"/>
+          <w:bCs w:val="1"/>
+          <w:color w:val="000000"/>
+          <w:sz w:val="24"/>
+          <w:szCs w:val="24"/>
+        </w:rPr>
+      </w:pPr>
+      <w:bookmarkStart w:colFirst="0" w:colLast="0" w:name="_heading=h.61rgh51u9ati" w:id="9"/>
+      <w:bookmarkEnd w:id="9"/>
+      <w:r>
+        <w:rPr>
+          <w:rFonts w:ascii="Times New Roman" w:cs="Times New Roman" w:eastAsia="Times New Roman" w:hAnsi="Times New Roman"/>
+          <w:b w:val="1"/>
+          <w:bCs w:val="1"/>
+          <w:color w:val="000000"/>
+          <w:sz w:val="24"/>
+          <w:szCs w:val="24"/>
+          <w:rtl w:val="0"/>
+        </w:rPr>
+        <w:t xml:space="preserve">2. Riesgos</w:t>
+      </w:r>
+    </w:p>
+    <w:p>
+      <w:pPr>
+        <w:numPr>
+          <w:ilvl w:val="0"/>
+          <w:numId w:val="8"/>
+        </w:numPr>
+        <w:spacing w:after="0" w:line="360" w:lineRule="auto"/>
+        <w:ind w:left="1080" w:hanging="360"/>
+        <w:jc w:val="both"/>
+        <w:rPr>
+          <w:rFonts w:ascii="Times New Roman" w:cs="Times New Roman" w:eastAsia="Times New Roman" w:hAnsi="Times New Roman"/>
+          <w:sz w:val="24"/>
+          <w:szCs w:val="24"/>
+        </w:rPr>
+      </w:pPr>
+      <w:r>
+        <w:rPr>
+          <w:rFonts w:ascii="Times New Roman" w:cs="Times New Roman" w:eastAsia="Times New Roman" w:hAnsi="Times New Roman"/>
+          <w:b w:val="1"/>
+          <w:bCs w:val="1"/>
+          <w:sz w:val="24"/>
+          <w:szCs w:val="24"/>
+          <w:rtl w:val="0"/>
+        </w:rPr>
+        <w:t xml:space="preserve">Desincronización del Inventario Físico:</w:t>
+      </w:r>
+      <w:r>
+        <w:rPr>
+          <w:rFonts w:ascii="Times New Roman" w:cs="Times New Roman" w:eastAsia="Times New Roman" w:hAnsi="Times New Roman"/>
+          <w:sz w:val="24"/>
+          <w:szCs w:val="24"/>
+          <w:rtl w:val="0"/>
+        </w:rPr>
+        <w:t xml:space="preserve"> Existe la posibilidad de que la base de datos no refleje en tiempo real si un libro físico ha sido tomado de la estantería de la UPT sin ser registrado, lo que generaría desconfianza en el usuario ante datos inexactos.</w:t>
+      </w:r>
+    </w:p>
+    <w:p>
+      <w:pPr>
+        <w:numPr>
+          <w:ilvl w:val="0"/>
+          <w:numId w:val="8"/>
+        </w:numPr>
+        <w:spacing w:after="0" w:line="360" w:lineRule="auto"/>
+        <w:ind w:left="1080" w:hanging="360"/>
+        <w:jc w:val="both"/>
+        <w:rPr>
+          <w:rFonts w:ascii="Times New Roman" w:cs="Times New Roman" w:eastAsia="Times New Roman" w:hAnsi="Times New Roman"/>
+          <w:sz w:val="24"/>
+          <w:szCs w:val="24"/>
+        </w:rPr>
+      </w:pPr>
+      <w:r>
+        <w:rPr>
+          <w:rFonts w:ascii="Times New Roman" w:cs="Times New Roman" w:eastAsia="Times New Roman" w:hAnsi="Times New Roman"/>
+          <w:b w:val="1"/>
+          <w:bCs w:val="1"/>
+          <w:sz w:val="24"/>
+          <w:szCs w:val="24"/>
+          <w:rtl w:val="0"/>
+        </w:rPr>
+        <w:t xml:space="preserve">Interrupción o Latencia de APIs Externas:</w:t>
+      </w:r>
+      <w:r>
+        <w:rPr>
+          <w:rFonts w:ascii="Times New Roman" w:cs="Times New Roman" w:eastAsia="Times New Roman" w:hAnsi="Times New Roman"/>
+          <w:sz w:val="24"/>
+          <w:szCs w:val="24"/>
+          <w:rtl w:val="0"/>
+        </w:rPr>
+        <w:t xml:space="preserve"> Al depender de las plataformas Alpha Cloud y E-Libro, el sistema queda sujeto a la disponibilidad técnica de estos proveedores; cualquier caída en sus servicios o lentitud en sus tiempos de respuesta afectará directamente la experiencia de búsqueda unificada.</w:t>
+      </w:r>
+    </w:p>
+    <w:p>
+      <w:pPr>
+        <w:numPr>
+          <w:ilvl w:val="0"/>
+          <w:numId w:val="8"/>
+        </w:numPr>
+        <w:spacing w:after="0" w:line="360" w:lineRule="auto"/>
+        <w:ind w:left="1080" w:hanging="360"/>
+        <w:jc w:val="both"/>
+        <w:rPr>
+          <w:rFonts w:ascii="Times New Roman" w:cs="Times New Roman" w:eastAsia="Times New Roman" w:hAnsi="Times New Roman"/>
+          <w:sz w:val="24"/>
+          <w:szCs w:val="24"/>
+        </w:rPr>
+      </w:pPr>
+      <w:r>
+        <w:rPr>
+          <w:rFonts w:ascii="Times New Roman" w:cs="Times New Roman" w:eastAsia="Times New Roman" w:hAnsi="Times New Roman"/>
+          <w:b w:val="1"/>
+          <w:bCs w:val="1"/>
+          <w:sz w:val="24"/>
+          <w:szCs w:val="24"/>
+          <w:rtl w:val="0"/>
+        </w:rPr>
+        <w:t xml:space="preserve">Inconsistencia en la Consolidación de Metadatos:</w:t>
+      </w:r>
+      <w:r>
+        <w:rPr>
+          <w:rFonts w:ascii="Times New Roman" w:cs="Times New Roman" w:eastAsia="Times New Roman" w:hAnsi="Times New Roman"/>
+          <w:sz w:val="24"/>
+          <w:szCs w:val="24"/>
+          <w:rtl w:val="0"/>
+        </w:rPr>
+        <w:t xml:space="preserve"> La integración de tres fuentes distintas (UPT, Alpha Cloud y E-Libro) aumenta el riesgo de encontrar registros duplicados o formatos de metadatos incompatibles, lo que podría complicar la visualización homogénea de los recursos.</w:t>
+      </w:r>
+    </w:p>
+    <w:p>
+      <w:pPr>
+        <w:numPr>
+          <w:ilvl w:val="0"/>
+          <w:numId w:val="8"/>
+        </w:numPr>
+        <w:spacing w:after="0" w:line="360" w:lineRule="auto"/>
+        <w:ind w:left="1080" w:hanging="360"/>
+        <w:jc w:val="both"/>
+        <w:rPr>
+          <w:rFonts w:ascii="Times New Roman" w:cs="Times New Roman" w:eastAsia="Times New Roman" w:hAnsi="Times New Roman"/>
+          <w:sz w:val="24"/>
+          <w:szCs w:val="24"/>
+        </w:rPr>
+      </w:pPr>
+      <w:r>
+        <w:rPr>
+          <w:rFonts w:ascii="Times New Roman" w:cs="Times New Roman" w:eastAsia="Times New Roman" w:hAnsi="Times New Roman"/>
+          <w:b w:val="1"/>
+          <w:bCs w:val="1"/>
+          <w:sz w:val="24"/>
+          <w:szCs w:val="24"/>
+          <w:rtl w:val="0"/>
+        </w:rPr>
+        <w:t xml:space="preserve">Limitación de Créditos en la Nube:</w:t>
+      </w:r>
+      <w:r>
+        <w:rPr>
+          <w:rFonts w:ascii="Times New Roman" w:cs="Times New Roman" w:eastAsia="Times New Roman" w:hAnsi="Times New Roman"/>
+          <w:sz w:val="24"/>
+          <w:szCs w:val="24"/>
+          <w:rtl w:val="0"/>
+        </w:rPr>
+        <w:t xml:space="preserve"> Al utilizar Microsoft Azure para el despliegue, persiste el riesgo de agotar la cuota de créditos de estudiante antes de completar las pruebas de rendimiento, afectando la disponibilidad operativa a largo plazo.</w:t>
+      </w:r>
+    </w:p>
+    <w:p>
+      <w:pPr>
+        <w:numPr>
+          <w:ilvl w:val="0"/>
+          <w:numId w:val="8"/>
+        </w:numPr>
+        <w:spacing w:after="0" w:line="360" w:lineRule="auto"/>
+        <w:ind w:left="1080" w:hanging="360"/>
+        <w:jc w:val="both"/>
+        <w:rPr>
+          <w:rFonts w:ascii="Times New Roman" w:cs="Times New Roman" w:eastAsia="Times New Roman" w:hAnsi="Times New Roman"/>
+          <w:sz w:val="24"/>
+          <w:szCs w:val="24"/>
+        </w:rPr>
+      </w:pPr>
+      <w:r>
+        <w:rPr>
+          <w:rFonts w:ascii="Times New Roman" w:cs="Times New Roman" w:eastAsia="Times New Roman" w:hAnsi="Times New Roman"/>
+          <w:b w:val="1"/>
+          <w:bCs w:val="1"/>
+          <w:sz w:val="24"/>
+          <w:szCs w:val="24"/>
+          <w:rtl w:val="0"/>
+        </w:rPr>
+        <w:t xml:space="preserve">Gestión de Infraestructura como Código:</w:t>
+      </w:r>
+      <w:r>
+        <w:rPr>
+          <w:rFonts w:ascii="Times New Roman" w:cs="Times New Roman" w:eastAsia="Times New Roman" w:hAnsi="Times New Roman"/>
+          <w:sz w:val="24"/>
+          <w:szCs w:val="24"/>
+          <w:rtl w:val="0"/>
+        </w:rPr>
+        <w:t xml:space="preserve"> El uso de Terraform requiere una configuración extremadamente precisa; errores en los scripts de automatización podrían derivar en fallos en la provisión de recursos en la nube o estimaciones de costos erróneas</w:t>
+      </w:r>
+    </w:p>
+    <w:p>
+      <w:pPr>
+        <w:pStyle w:val="Heading1"/>
+        <w:spacing w:before="0" w:line="360" w:lineRule="auto"/>
+        <w:jc w:val="both"/>
+        <w:rPr>
+          <w:rFonts w:ascii="Times New Roman" w:cs="Times New Roman" w:eastAsia="Times New Roman" w:hAnsi="Times New Roman"/>
+          <w:b w:val="1"/>
+          <w:bCs w:val="1"/>
+          <w:color w:val="000000"/>
+          <w:sz w:val="24"/>
+          <w:szCs w:val="24"/>
+        </w:rPr>
+      </w:pPr>
+      <w:bookmarkStart w:colFirst="0" w:colLast="0" w:name="_heading=h.qmmlravdeyr1" w:id="10"/>
+      <w:bookmarkEnd w:id="10"/>
+      <w:r>
+        <w:rPr>
+          <w:rFonts w:ascii="Times New Roman" w:cs="Times New Roman" w:eastAsia="Times New Roman" w:hAnsi="Times New Roman"/>
+          <w:b w:val="1"/>
+          <w:bCs w:val="1"/>
+          <w:color w:val="000000"/>
+          <w:sz w:val="24"/>
+          <w:szCs w:val="24"/>
+          <w:rtl w:val="0"/>
+        </w:rPr>
+        <w:t xml:space="preserve">3. Análisis de la situación actual</w:t>
+      </w:r>
+    </w:p>
+    <w:p>
+      <w:pPr>
+        <w:pStyle w:val="Heading2"/>
+        <w:spacing w:after="0" w:before="0" w:line="360" w:lineRule="auto"/>
+        <w:jc w:val="both"/>
+        <w:rPr>
+          <w:rFonts w:ascii="Times New Roman" w:cs="Times New Roman" w:eastAsia="Times New Roman" w:hAnsi="Times New Roman"/>
+          <w:sz w:val="24"/>
+          <w:szCs w:val="24"/>
+        </w:rPr>
+      </w:pPr>
+      <w:bookmarkStart w:colFirst="0" w:colLast="0" w:name="_heading=h.u8b1idtu7vqf" w:id="11"/>
+      <w:bookmarkEnd w:id="11"/>
+      <w:r>
+        <w:rPr>
+          <w:rFonts w:ascii="Times New Roman" w:cs="Times New Roman" w:eastAsia="Times New Roman" w:hAnsi="Times New Roman"/>
+          <w:sz w:val="24"/>
+          <w:szCs w:val="24"/>
+          <w:rtl w:val="0"/>
+        </w:rPr>
+        <w:t xml:space="preserve">3.1 Planteamiento del problema</w:t>
+      </w:r>
+    </w:p>
+    <w:p>
+      <w:pPr>
+        <w:spacing w:after="0" w:line="360" w:lineRule="auto"/>
+        <w:jc w:val="both"/>
+        <w:rPr>
+          <w:rFonts w:ascii="Times New Roman" w:cs="Times New Roman" w:eastAsia="Times New Roman" w:hAnsi="Times New Roman"/>
+          <w:sz w:val="24"/>
+          <w:szCs w:val="24"/>
+        </w:rPr>
+      </w:pPr>
+      <w:r>
+        <w:rPr>
+          <w:rFonts w:ascii="Times New Roman" w:cs="Times New Roman" w:eastAsia="Times New Roman" w:hAnsi="Times New Roman"/>
+          <w:sz w:val="24"/>
+          <w:szCs w:val="24"/>
+          <w:rtl w:val="0"/>
+        </w:rPr>
+        <w:t xml:space="preserve">Si bien las instituciones académicas enfatizan constantemente la importancia del acceso a la información y la investigación de calidad, los métodos de búsqueda y localización de recursos bibliográficos pueden parecer anticuados y poco efectivos. Es necesario modernizar la forma en que se procesa el acceso a la información en las facultades y bibliotecas universitarias. Aunque los estudiantes y docentes obtienen bases teóricas para sus investigaciones, no encuentran herramientas tecnológicas integradas que les permitan localizar de manera ágil tanto el material físico como el digital en un solo lugar.</w:t>
+      </w:r>
+    </w:p>
+    <w:p>
+      <w:pPr>
+        <w:spacing w:after="0" w:line="360" w:lineRule="auto"/>
+        <w:jc w:val="both"/>
+        <w:rPr>
+          <w:rFonts w:ascii="Times New Roman" w:cs="Times New Roman" w:eastAsia="Times New Roman" w:hAnsi="Times New Roman"/>
+          <w:sz w:val="24"/>
+          <w:szCs w:val="24"/>
+        </w:rPr>
+      </w:pPr>
+      <w:r>
+        <w:rPr>
+          <w:rFonts w:ascii="Times New Roman" w:cs="Times New Roman" w:eastAsia="Times New Roman" w:hAnsi="Times New Roman"/>
+          <w:sz w:val="24"/>
+          <w:szCs w:val="24"/>
+          <w:rtl w:val="0"/>
+        </w:rPr>
+        <w:t xml:space="preserve">La falta de una plataforma centralizada que combine el inventario físico con el repositorio virtual limita la posibilidad de que el tiempo invertido en la búsqueda se traduzca en una investigación eficiente. Este desajuste entre la existencia del recurso y su accesibilidad genera desmotivación: los investigadores no logran visualizar la totalidad de la oferta bibliográfica de la institución en una sola interfaz, mientras que los administradores de la biblioteca carecen de un sistema unificado que vincule la gestión de estanterías con los archivos electrónicos.</w:t>
+      </w:r>
+    </w:p>
+    <w:p>
+      <w:pPr>
+        <w:pStyle w:val="Heading2"/>
+        <w:spacing w:after="0" w:before="0" w:line="360" w:lineRule="auto"/>
+        <w:jc w:val="both"/>
+        <w:rPr>
+          <w:rFonts w:ascii="Times New Roman" w:cs="Times New Roman" w:eastAsia="Times New Roman" w:hAnsi="Times New Roman"/>
+          <w:sz w:val="24"/>
+          <w:szCs w:val="24"/>
+        </w:rPr>
+      </w:pPr>
+      <w:bookmarkStart w:colFirst="0" w:colLast="0" w:name="_heading=h.n1hdkoceo2e3" w:id="12"/>
+      <w:bookmarkEnd w:id="12"/>
+      <w:r>
+        <w:rPr>
+          <w:rFonts w:ascii="Times New Roman" w:cs="Times New Roman" w:eastAsia="Times New Roman" w:hAnsi="Times New Roman"/>
+          <w:sz w:val="24"/>
+          <w:szCs w:val="24"/>
+          <w:rtl w:val="0"/>
+        </w:rPr>
+        <w:t xml:space="preserve">3.2 Consideraciones de hardware y software</w:t>
+      </w:r>
+    </w:p>
+    <w:p>
+      <w:pPr>
+        <w:spacing w:after="0" w:line="360" w:lineRule="auto"/>
+        <w:ind w:left="360" w:firstLine="0"/>
+        <w:jc w:val="both"/>
+        <w:rPr>
+          <w:rFonts w:ascii="Times New Roman" w:cs="Times New Roman" w:eastAsia="Times New Roman" w:hAnsi="Times New Roman"/>
+          <w:sz w:val="24"/>
+          <w:szCs w:val="24"/>
+          <w:u w:val="single"/>
+        </w:rPr>
+      </w:pPr>
+      <w:r>
+        <w:rPr>
+          <w:rFonts w:ascii="Times New Roman" w:cs="Times New Roman" w:eastAsia="Times New Roman" w:hAnsi="Times New Roman"/>
+          <w:sz w:val="24"/>
+          <w:szCs w:val="24"/>
+          <w:u w:val="single"/>
+          <w:rtl w:val="0"/>
+        </w:rPr>
+        <w:t xml:space="preserve">Hardware:</w:t>
       </w:r>
     </w:p>
     <w:p>
@@ -3639,41 +4159,29 @@
       <w:r>
         <w:rPr>
           <w:rFonts w:ascii="Times New Roman" w:cs="Times New Roman" w:eastAsia="Times New Roman" w:hAnsi="Times New Roman"/>
-          <w:sz w:val="24"/>
-          <w:szCs w:val="24"/>
-          <w:rtl w:val="0"/>
-        </w:rPr>
-        <w:t xml:space="preserve">Desarrollar una plataforma web unificada que optimice la localización y el acceso a recursos bibliográficos físicos y digitales, mejorando la experiencia de búsqueda y la gestión de información para la comunidad académica.</w:t>
-      </w:r>
-    </w:p>
-    <w:p>
-      <w:pPr>
-        <w:pStyle w:val="Heading3"/>
-        <w:spacing w:after="0" w:before="0" w:line="360" w:lineRule="auto"/>
-        <w:jc w:val="both"/>
-        <w:rPr>
-          <w:rFonts w:ascii="Times New Roman" w:cs="Times New Roman" w:eastAsia="Times New Roman" w:hAnsi="Times New Roman"/>
-          <w:sz w:val="24"/>
-          <w:szCs w:val="24"/>
-        </w:rPr>
-      </w:pPr>
-      <w:bookmarkStart w:colFirst="0" w:colLast="0" w:name="_heading=h.qloqizxbkk1a" w:id="8"/>
-      <w:bookmarkEnd w:id="8"/>
-      <w:r>
-        <w:rPr>
-          <w:rFonts w:ascii="Times New Roman" w:cs="Times New Roman" w:eastAsia="Times New Roman" w:hAnsi="Times New Roman"/>
-          <w:sz w:val="24"/>
-          <w:szCs w:val="24"/>
-          <w:rtl w:val="0"/>
-        </w:rPr>
-        <w:t xml:space="preserve">1.4.2 Objetivos específicos</w:t>
+          <w:b w:val="1"/>
+          <w:bCs w:val="1"/>
+          <w:sz w:val="24"/>
+          <w:szCs w:val="24"/>
+          <w:rtl w:val="0"/>
+        </w:rPr>
+        <w:t xml:space="preserve">CPU: </w:t>
+      </w:r>
+      <w:r>
+        <w:rPr>
+          <w:rFonts w:ascii="Times New Roman" w:cs="Times New Roman" w:eastAsia="Times New Roman" w:hAnsi="Times New Roman"/>
+          <w:sz w:val="24"/>
+          <w:szCs w:val="24"/>
+          <w:rtl w:val="0"/>
+        </w:rPr>
+        <w:t xml:space="preserve">2 vCPU mínimo</w:t>
       </w:r>
     </w:p>
     <w:p>
       <w:pPr>
         <w:numPr>
           <w:ilvl w:val="0"/>
-          <w:numId w:val="6"/>
+          <w:numId w:val="2"/>
         </w:numPr>
         <w:spacing w:after="0" w:line="360" w:lineRule="auto"/>
         <w:ind w:left="1080" w:hanging="360"/>
@@ -3687,18 +4195,29 @@
       <w:r>
         <w:rPr>
           <w:rFonts w:ascii="Times New Roman" w:cs="Times New Roman" w:eastAsia="Times New Roman" w:hAnsi="Times New Roman"/>
-          <w:sz w:val="24"/>
-          <w:szCs w:val="24"/>
-          <w:rtl w:val="0"/>
-        </w:rPr>
-        <w:t xml:space="preserve">Diseñar un sistema de búsqueda multicanal que filtre resultados por título, autor, categoría y tipo de recurso (físico o virtual).</w:t>
+          <w:b w:val="1"/>
+          <w:bCs w:val="1"/>
+          <w:sz w:val="24"/>
+          <w:szCs w:val="24"/>
+          <w:rtl w:val="0"/>
+        </w:rPr>
+        <w:t xml:space="preserve">Memoria RAM</w:t>
+      </w:r>
+      <w:r>
+        <w:rPr>
+          <w:rFonts w:ascii="Times New Roman" w:cs="Times New Roman" w:eastAsia="Times New Roman" w:hAnsi="Times New Roman"/>
+          <w:sz w:val="24"/>
+          <w:szCs w:val="24"/>
+          <w:rtl w:val="0"/>
+        </w:rPr>
+        <w:t xml:space="preserve">: 4 GB</w:t>
       </w:r>
     </w:p>
     <w:p>
       <w:pPr>
         <w:numPr>
           <w:ilvl w:val="0"/>
-          <w:numId w:val="6"/>
+          <w:numId w:val="2"/>
         </w:numPr>
         <w:spacing w:after="0" w:line="360" w:lineRule="auto"/>
         <w:ind w:left="1080" w:hanging="360"/>
@@ -3712,491 +4231,8 @@
       <w:r>
         <w:rPr>
           <w:rFonts w:ascii="Times New Roman" w:cs="Times New Roman" w:eastAsia="Times New Roman" w:hAnsi="Times New Roman"/>
-          <w:sz w:val="24"/>
-          <w:szCs w:val="24"/>
-          <w:rtl w:val="0"/>
-        </w:rPr>
-        <w:t xml:space="preserve">Integrar una base de datos local de inventario físico que permita visualizar la disponibilidad de textos en tiempo real.</w:t>
-      </w:r>
-    </w:p>
-    <w:p>
-      <w:pPr>
-        <w:numPr>
-          <w:ilvl w:val="0"/>
-          <w:numId w:val="6"/>
-        </w:numPr>
-        <w:spacing w:after="0" w:line="360" w:lineRule="auto"/>
-        <w:ind w:left="1080" w:hanging="360"/>
-        <w:jc w:val="both"/>
-        <w:rPr>
-          <w:rFonts w:ascii="Times New Roman" w:cs="Times New Roman" w:eastAsia="Times New Roman" w:hAnsi="Times New Roman"/>
-          <w:sz w:val="24"/>
-          <w:szCs w:val="24"/>
-        </w:rPr>
-      </w:pPr>
-      <w:r>
-        <w:rPr>
-          <w:rFonts w:ascii="Times New Roman" w:cs="Times New Roman" w:eastAsia="Times New Roman" w:hAnsi="Times New Roman"/>
-          <w:sz w:val="24"/>
-          <w:szCs w:val="24"/>
-          <w:rtl w:val="0"/>
-        </w:rPr>
-        <w:t xml:space="preserve">Integrar un repositorio digital seguro que permita el almacenamiento y la visualización de archivos electrónicos.</w:t>
-      </w:r>
-    </w:p>
-    <w:p>
-      <w:pPr>
-        <w:numPr>
-          <w:ilvl w:val="0"/>
-          <w:numId w:val="6"/>
-        </w:numPr>
-        <w:spacing w:after="0" w:line="360" w:lineRule="auto"/>
-        <w:ind w:left="1080" w:hanging="360"/>
-        <w:jc w:val="both"/>
-        <w:rPr>
-          <w:rFonts w:ascii="Times New Roman" w:cs="Times New Roman" w:eastAsia="Times New Roman" w:hAnsi="Times New Roman"/>
-          <w:sz w:val="24"/>
-          <w:szCs w:val="24"/>
-        </w:rPr>
-      </w:pPr>
-      <w:r>
-        <w:rPr>
-          <w:rFonts w:ascii="Times New Roman" w:cs="Times New Roman" w:eastAsia="Times New Roman" w:hAnsi="Times New Roman"/>
-          <w:sz w:val="24"/>
-          <w:szCs w:val="24"/>
-          <w:rtl w:val="0"/>
-        </w:rPr>
-        <w:t xml:space="preserve">Configurar la infraestructura como código (IaC) mediante Terraform para automatizar el despliegue de los servicios en Microsoft Azure y estimar con precisión los costos operativos.</w:t>
-      </w:r>
-    </w:p>
-    <w:p>
-      <w:pPr>
-        <w:numPr>
-          <w:ilvl w:val="0"/>
-          <w:numId w:val="6"/>
-        </w:numPr>
-        <w:spacing w:after="0" w:line="360" w:lineRule="auto"/>
-        <w:ind w:left="1080" w:hanging="360"/>
-        <w:jc w:val="both"/>
-        <w:rPr>
-          <w:rFonts w:ascii="Times New Roman" w:cs="Times New Roman" w:eastAsia="Times New Roman" w:hAnsi="Times New Roman"/>
-          <w:sz w:val="24"/>
-          <w:szCs w:val="24"/>
-        </w:rPr>
-      </w:pPr>
-      <w:r>
-        <w:rPr>
-          <w:rFonts w:ascii="Times New Roman" w:cs="Times New Roman" w:eastAsia="Times New Roman" w:hAnsi="Times New Roman"/>
-          <w:sz w:val="24"/>
-          <w:szCs w:val="24"/>
-          <w:rtl w:val="0"/>
-        </w:rPr>
-        <w:t xml:space="preserve">Garantizar la escalabilidad del sistema, permitiendo la futura integración con bases de datos de otras facultades o instituciones.</w:t>
-      </w:r>
-    </w:p>
-    <w:p>
-      <w:pPr>
-        <w:pStyle w:val="Heading1"/>
-        <w:spacing w:before="0" w:line="360" w:lineRule="auto"/>
-        <w:jc w:val="both"/>
-        <w:rPr>
-          <w:rFonts w:ascii="Times New Roman" w:cs="Times New Roman" w:eastAsia="Times New Roman" w:hAnsi="Times New Roman"/>
           <w:b w:val="1"/>
           <w:bCs w:val="1"/>
-          <w:color w:val="000000"/>
-          <w:sz w:val="24"/>
-          <w:szCs w:val="24"/>
-        </w:rPr>
-      </w:pPr>
-      <w:bookmarkStart w:colFirst="0" w:colLast="0" w:name="_heading=h.61rgh51u9ati" w:id="9"/>
-      <w:bookmarkEnd w:id="9"/>
-      <w:r>
-        <w:rPr>
-          <w:rFonts w:ascii="Times New Roman" w:cs="Times New Roman" w:eastAsia="Times New Roman" w:hAnsi="Times New Roman"/>
-          <w:b w:val="1"/>
-          <w:bCs w:val="1"/>
-          <w:color w:val="000000"/>
-          <w:sz w:val="24"/>
-          <w:szCs w:val="24"/>
-          <w:rtl w:val="0"/>
-        </w:rPr>
-        <w:t xml:space="preserve">2. Riesgos</w:t>
-      </w:r>
-    </w:p>
-    <w:p>
-      <w:pPr>
-        <w:numPr>
-          <w:ilvl w:val="0"/>
-          <w:numId w:val="8"/>
-        </w:numPr>
-        <w:spacing w:after="0" w:line="360" w:lineRule="auto"/>
-        <w:ind w:left="1080" w:hanging="360"/>
-        <w:jc w:val="both"/>
-        <w:rPr>
-          <w:rFonts w:ascii="Times New Roman" w:cs="Times New Roman" w:eastAsia="Times New Roman" w:hAnsi="Times New Roman"/>
-          <w:sz w:val="24"/>
-          <w:szCs w:val="24"/>
-        </w:rPr>
-      </w:pPr>
-      <w:r>
-        <w:rPr>
-          <w:rFonts w:ascii="Times New Roman" w:cs="Times New Roman" w:eastAsia="Times New Roman" w:hAnsi="Times New Roman"/>
-          <w:b w:val="1"/>
-          <w:bCs w:val="1"/>
-          <w:sz w:val="24"/>
-          <w:szCs w:val="24"/>
-          <w:rtl w:val="0"/>
-        </w:rPr>
-        <w:t xml:space="preserve">Desincronización de Inventario Físico:</w:t>
-      </w:r>
-      <w:r>
-        <w:rPr>
-          <w:rFonts w:ascii="Times New Roman" w:cs="Times New Roman" w:eastAsia="Times New Roman" w:hAnsi="Times New Roman"/>
-          <w:sz w:val="24"/>
-          <w:szCs w:val="24"/>
-          <w:rtl w:val="0"/>
-        </w:rPr>
-        <w:t xml:space="preserve"> Existe la posibilidad de que la base de datos no refleje en tiempo real si un libro físico ha sido tomado de la estantería sin ser registrado, lo que podría generar desconfianza en el usuario al encontrar datos inexactos.</w:t>
-      </w:r>
-    </w:p>
-    <w:p>
-      <w:pPr>
-        <w:numPr>
-          <w:ilvl w:val="0"/>
-          <w:numId w:val="8"/>
-        </w:numPr>
-        <w:spacing w:after="0" w:line="360" w:lineRule="auto"/>
-        <w:ind w:left="1080" w:hanging="360"/>
-        <w:jc w:val="both"/>
-        <w:rPr>
-          <w:rFonts w:ascii="Times New Roman" w:cs="Times New Roman" w:eastAsia="Times New Roman" w:hAnsi="Times New Roman"/>
-          <w:sz w:val="24"/>
-          <w:szCs w:val="24"/>
-        </w:rPr>
-      </w:pPr>
-      <w:r>
-        <w:rPr>
-          <w:rFonts w:ascii="Times New Roman" w:cs="Times New Roman" w:eastAsia="Times New Roman" w:hAnsi="Times New Roman"/>
-          <w:b w:val="1"/>
-          <w:bCs w:val="1"/>
-          <w:sz w:val="24"/>
-          <w:szCs w:val="24"/>
-          <w:rtl w:val="0"/>
-        </w:rPr>
-        <w:t xml:space="preserve">Complejidad en la Integración de Recursos:</w:t>
-      </w:r>
-      <w:r>
-        <w:rPr>
-          <w:rFonts w:ascii="Times New Roman" w:cs="Times New Roman" w:eastAsia="Times New Roman" w:hAnsi="Times New Roman"/>
-          <w:sz w:val="24"/>
-          <w:szCs w:val="24"/>
-          <w:rtl w:val="0"/>
-        </w:rPr>
-        <w:t xml:space="preserve"> La carga de archivos digitales de gran tamaño o formatos no compatibles podría afectar los tiempos de respuesta del servidor y la experiencia de navegación del estudiante.</w:t>
-      </w:r>
-    </w:p>
-    <w:p>
-      <w:pPr>
-        <w:numPr>
-          <w:ilvl w:val="0"/>
-          <w:numId w:val="8"/>
-        </w:numPr>
-        <w:spacing w:after="0" w:line="360" w:lineRule="auto"/>
-        <w:ind w:left="1080" w:hanging="360"/>
-        <w:jc w:val="both"/>
-        <w:rPr>
-          <w:rFonts w:ascii="Times New Roman" w:cs="Times New Roman" w:eastAsia="Times New Roman" w:hAnsi="Times New Roman"/>
-          <w:sz w:val="24"/>
-          <w:szCs w:val="24"/>
-        </w:rPr>
-      </w:pPr>
-      <w:r>
-        <w:rPr>
-          <w:rFonts w:ascii="Times New Roman" w:cs="Times New Roman" w:eastAsia="Times New Roman" w:hAnsi="Times New Roman"/>
-          <w:b w:val="1"/>
-          <w:bCs w:val="1"/>
-          <w:sz w:val="24"/>
-          <w:szCs w:val="24"/>
-          <w:rtl w:val="0"/>
-        </w:rPr>
-        <w:t xml:space="preserve">Limitación de Créditos en la Nube:</w:t>
-      </w:r>
-      <w:r>
-        <w:rPr>
-          <w:rFonts w:ascii="Times New Roman" w:cs="Times New Roman" w:eastAsia="Times New Roman" w:hAnsi="Times New Roman"/>
-          <w:sz w:val="24"/>
-          <w:szCs w:val="24"/>
-          <w:rtl w:val="0"/>
-        </w:rPr>
-        <w:t xml:space="preserve"> Al utilizar Azure para el despliegue final, existe el riesgo de agotar la cuota de servicios gratuitos o créditos de estudiante antes de finalizar las pruebas de rendimiento, lo que dificultará la disponibilidad operativa a largo plazo.</w:t>
-      </w:r>
-    </w:p>
-    <w:p>
-      <w:pPr>
-        <w:numPr>
-          <w:ilvl w:val="0"/>
-          <w:numId w:val="8"/>
-        </w:numPr>
-        <w:spacing w:after="0" w:line="360" w:lineRule="auto"/>
-        <w:ind w:left="1080" w:hanging="360"/>
-        <w:jc w:val="both"/>
-        <w:rPr>
-          <w:rFonts w:ascii="Times New Roman" w:cs="Times New Roman" w:eastAsia="Times New Roman" w:hAnsi="Times New Roman"/>
-          <w:sz w:val="24"/>
-          <w:szCs w:val="24"/>
-        </w:rPr>
-      </w:pPr>
-      <w:r>
-        <w:rPr>
-          <w:rFonts w:ascii="Times New Roman" w:cs="Times New Roman" w:eastAsia="Times New Roman" w:hAnsi="Times New Roman"/>
-          <w:b w:val="1"/>
-          <w:bCs w:val="1"/>
-          <w:sz w:val="24"/>
-          <w:szCs w:val="24"/>
-          <w:rtl w:val="0"/>
-        </w:rPr>
-        <w:t xml:space="preserve">Curva de Aprendizaje en Infraestructura como Código:</w:t>
-      </w:r>
-      <w:r>
-        <w:rPr>
-          <w:rFonts w:ascii="Times New Roman" w:cs="Times New Roman" w:eastAsia="Times New Roman" w:hAnsi="Times New Roman"/>
-          <w:sz w:val="24"/>
-          <w:szCs w:val="24"/>
-          <w:rtl w:val="0"/>
-        </w:rPr>
-        <w:t xml:space="preserve"> El uso de Terraform para el análisis económico y despliegue requiere una configuración precisa; cualquier error en los scripts podría resultar en una estimación de costos errónea o fallos en la provisión de recursos en Azure.</w:t>
-      </w:r>
-    </w:p>
-    <w:p>
-      <w:pPr>
-        <w:pStyle w:val="Heading1"/>
-        <w:spacing w:before="0" w:line="360" w:lineRule="auto"/>
-        <w:jc w:val="both"/>
-        <w:rPr>
-          <w:rFonts w:ascii="Times New Roman" w:cs="Times New Roman" w:eastAsia="Times New Roman" w:hAnsi="Times New Roman"/>
-          <w:b w:val="1"/>
-          <w:bCs w:val="1"/>
-          <w:color w:val="000000"/>
-          <w:sz w:val="24"/>
-          <w:szCs w:val="24"/>
-        </w:rPr>
-      </w:pPr>
-      <w:bookmarkStart w:colFirst="0" w:colLast="0" w:name="_heading=h.qmmlravdeyr1" w:id="10"/>
-      <w:bookmarkEnd w:id="10"/>
-      <w:r>
-        <w:rPr>
-          <w:rFonts w:ascii="Times New Roman" w:cs="Times New Roman" w:eastAsia="Times New Roman" w:hAnsi="Times New Roman"/>
-          <w:b w:val="1"/>
-          <w:bCs w:val="1"/>
-          <w:color w:val="000000"/>
-          <w:sz w:val="24"/>
-          <w:szCs w:val="24"/>
-          <w:rtl w:val="0"/>
-        </w:rPr>
-        <w:t xml:space="preserve">3. Análisis de la situación actual</w:t>
-      </w:r>
-    </w:p>
-    <w:p>
-      <w:pPr>
-        <w:pStyle w:val="Heading2"/>
-        <w:spacing w:after="0" w:before="0" w:line="360" w:lineRule="auto"/>
-        <w:jc w:val="both"/>
-        <w:rPr>
-          <w:rFonts w:ascii="Times New Roman" w:cs="Times New Roman" w:eastAsia="Times New Roman" w:hAnsi="Times New Roman"/>
-          <w:sz w:val="24"/>
-          <w:szCs w:val="24"/>
-        </w:rPr>
-      </w:pPr>
-      <w:bookmarkStart w:colFirst="0" w:colLast="0" w:name="_heading=h.u8b1idtu7vqf" w:id="11"/>
-      <w:bookmarkEnd w:id="11"/>
-      <w:r>
-        <w:rPr>
-          <w:rFonts w:ascii="Times New Roman" w:cs="Times New Roman" w:eastAsia="Times New Roman" w:hAnsi="Times New Roman"/>
-          <w:sz w:val="24"/>
-          <w:szCs w:val="24"/>
-          <w:rtl w:val="0"/>
-        </w:rPr>
-        <w:t xml:space="preserve">3.1 Planteamiento del problema</w:t>
-      </w:r>
-    </w:p>
-    <w:p>
-      <w:pPr>
-        <w:spacing w:after="0" w:line="360" w:lineRule="auto"/>
-        <w:jc w:val="both"/>
-        <w:rPr>
-          <w:rFonts w:ascii="Times New Roman" w:cs="Times New Roman" w:eastAsia="Times New Roman" w:hAnsi="Times New Roman"/>
-          <w:sz w:val="24"/>
-          <w:szCs w:val="24"/>
-        </w:rPr>
-      </w:pPr>
-      <w:r>
-        <w:rPr>
-          <w:rFonts w:ascii="Times New Roman" w:cs="Times New Roman" w:eastAsia="Times New Roman" w:hAnsi="Times New Roman"/>
-          <w:sz w:val="24"/>
-          <w:szCs w:val="24"/>
-          <w:rtl w:val="0"/>
-        </w:rPr>
-        <w:t xml:space="preserve">Si bien las instituciones académicas enfatizan constantemente la importancia del acceso a la información y la investigación de calidad, los métodos de búsqueda y localización de recursos bibliográficos pueden parecer anticuados y poco efectivos. Es necesario modernizar la forma en que se procesa el acceso a la información en las facultades y bibliotecas universitarias. Aunque los estudiantes y docentes obtienen bases teóricas para sus investigaciones, no encuentran herramientas tecnológicas integradas que les permitan localizar de manera ágil tanto el material físico como el digital en un solo lugar.</w:t>
-      </w:r>
-    </w:p>
-    <w:p>
-      <w:pPr>
-        <w:spacing w:after="0" w:line="360" w:lineRule="auto"/>
-        <w:jc w:val="both"/>
-        <w:rPr>
-          <w:rFonts w:ascii="Times New Roman" w:cs="Times New Roman" w:eastAsia="Times New Roman" w:hAnsi="Times New Roman"/>
-          <w:sz w:val="24"/>
-          <w:szCs w:val="24"/>
-        </w:rPr>
-      </w:pPr>
-      <w:r>
-        <w:rPr>
-          <w:rFonts w:ascii="Times New Roman" w:cs="Times New Roman" w:eastAsia="Times New Roman" w:hAnsi="Times New Roman"/>
-          <w:sz w:val="24"/>
-          <w:szCs w:val="24"/>
-          <w:rtl w:val="0"/>
-        </w:rPr>
-        <w:t xml:space="preserve">La falta de una plataforma centralizada que combine el inventario físico con el repositorio virtual limita la posibilidad de que el tiempo invertido en la búsqueda se traduzca en una investigación eficiente. Este desajuste entre la existencia del recurso y su accesibilidad genera desmotivación: los investigadores no logran visualizar la totalidad de la oferta bibliográfica de la institución en una sola interfaz, mientras que los administradores de la biblioteca carecen de un sistema unificado que vincule la gestión de estanterías con los archivos electrónicos.</w:t>
-      </w:r>
-    </w:p>
-    <w:p>
-      <w:pPr>
-        <w:pStyle w:val="Heading2"/>
-        <w:spacing w:after="0" w:before="0" w:line="360" w:lineRule="auto"/>
-        <w:jc w:val="both"/>
-        <w:rPr>
-          <w:rFonts w:ascii="Times New Roman" w:cs="Times New Roman" w:eastAsia="Times New Roman" w:hAnsi="Times New Roman"/>
-          <w:sz w:val="24"/>
-          <w:szCs w:val="24"/>
-        </w:rPr>
-      </w:pPr>
-      <w:bookmarkStart w:colFirst="0" w:colLast="0" w:name="_heading=h.n1hdkoceo2e3" w:id="12"/>
-      <w:bookmarkEnd w:id="12"/>
-      <w:r>
-        <w:rPr>
-          <w:rFonts w:ascii="Times New Roman" w:cs="Times New Roman" w:eastAsia="Times New Roman" w:hAnsi="Times New Roman"/>
-          <w:sz w:val="24"/>
-          <w:szCs w:val="24"/>
-          <w:rtl w:val="0"/>
-        </w:rPr>
-        <w:t xml:space="preserve">3.2 Consideraciones de hardware y software</w:t>
-      </w:r>
-    </w:p>
-    <w:p>
-      <w:pPr>
-        <w:spacing w:after="0" w:line="360" w:lineRule="auto"/>
-        <w:ind w:left="360" w:firstLine="0"/>
-        <w:jc w:val="both"/>
-        <w:rPr>
-          <w:rFonts w:ascii="Times New Roman" w:cs="Times New Roman" w:eastAsia="Times New Roman" w:hAnsi="Times New Roman"/>
-          <w:sz w:val="24"/>
-          <w:szCs w:val="24"/>
-          <w:u w:val="single"/>
-        </w:rPr>
-      </w:pPr>
-      <w:r>
-        <w:rPr>
-          <w:rFonts w:ascii="Times New Roman" w:cs="Times New Roman" w:eastAsia="Times New Roman" w:hAnsi="Times New Roman"/>
-          <w:sz w:val="24"/>
-          <w:szCs w:val="24"/>
-          <w:u w:val="single"/>
-          <w:rtl w:val="0"/>
-        </w:rPr>
-        <w:t xml:space="preserve">Hardware:</w:t>
-      </w:r>
-    </w:p>
-    <w:p>
-      <w:pPr>
-        <w:numPr>
-          <w:ilvl w:val="0"/>
-          <w:numId w:val="1"/>
-        </w:numPr>
-        <w:spacing w:after="0" w:line="360" w:lineRule="auto"/>
-        <w:ind w:left="1080" w:hanging="360"/>
-        <w:jc w:val="both"/>
-        <w:rPr>
-          <w:rFonts w:ascii="Times New Roman" w:cs="Times New Roman" w:eastAsia="Times New Roman" w:hAnsi="Times New Roman"/>
-          <w:sz w:val="24"/>
-          <w:szCs w:val="24"/>
-        </w:rPr>
-      </w:pPr>
-      <w:r>
-        <w:rPr>
-          <w:rFonts w:ascii="Times New Roman" w:cs="Times New Roman" w:eastAsia="Times New Roman" w:hAnsi="Times New Roman"/>
-          <w:b w:val="1"/>
-          <w:bCs w:val="1"/>
-          <w:sz w:val="24"/>
-          <w:szCs w:val="24"/>
-          <w:rtl w:val="0"/>
-        </w:rPr>
-        <w:t xml:space="preserve">CPU: </w:t>
-      </w:r>
-      <w:r>
-        <w:rPr>
-          <w:rFonts w:ascii="Times New Roman" w:cs="Times New Roman" w:eastAsia="Times New Roman" w:hAnsi="Times New Roman"/>
-          <w:sz w:val="24"/>
-          <w:szCs w:val="24"/>
-          <w:rtl w:val="0"/>
-        </w:rPr>
-        <w:t xml:space="preserve">2 vCPU mínimo</w:t>
-      </w:r>
-    </w:p>
-    <w:p>
-      <w:pPr>
-        <w:numPr>
-          <w:ilvl w:val="0"/>
-          <w:numId w:val="1"/>
-        </w:numPr>
-        <w:spacing w:after="0" w:line="360" w:lineRule="auto"/>
-        <w:ind w:left="1080" w:hanging="360"/>
-        <w:jc w:val="both"/>
-        <w:rPr>
-          <w:rFonts w:ascii="Times New Roman" w:cs="Times New Roman" w:eastAsia="Times New Roman" w:hAnsi="Times New Roman"/>
-          <w:sz w:val="24"/>
-          <w:szCs w:val="24"/>
-        </w:rPr>
-      </w:pPr>
-      <w:r>
-        <w:rPr>
-          <w:rFonts w:ascii="Times New Roman" w:cs="Times New Roman" w:eastAsia="Times New Roman" w:hAnsi="Times New Roman"/>
-          <w:b w:val="1"/>
-          <w:bCs w:val="1"/>
-          <w:sz w:val="24"/>
-          <w:szCs w:val="24"/>
-          <w:rtl w:val="0"/>
-        </w:rPr>
-        <w:t xml:space="preserve">Memoria RAM</w:t>
-      </w:r>
-      <w:r>
-        <w:rPr>
-          <w:rFonts w:ascii="Times New Roman" w:cs="Times New Roman" w:eastAsia="Times New Roman" w:hAnsi="Times New Roman"/>
-          <w:sz w:val="24"/>
-          <w:szCs w:val="24"/>
-          <w:rtl w:val="0"/>
-        </w:rPr>
-        <w:t xml:space="preserve">: 4 GB</w:t>
-      </w:r>
-    </w:p>
-    <w:p>
-      <w:pPr>
-        <w:numPr>
-          <w:ilvl w:val="0"/>
-          <w:numId w:val="1"/>
-        </w:numPr>
-        <w:spacing w:after="0" w:line="360" w:lineRule="auto"/>
-        <w:ind w:left="1080" w:hanging="360"/>
-        <w:jc w:val="both"/>
-        <w:rPr>
-          <w:rFonts w:ascii="Times New Roman" w:cs="Times New Roman" w:eastAsia="Times New Roman" w:hAnsi="Times New Roman"/>
-          <w:sz w:val="24"/>
-          <w:szCs w:val="24"/>
-        </w:rPr>
-      </w:pPr>
-      <w:r>
-        <w:rPr>
-          <w:rFonts w:ascii="Times New Roman" w:cs="Times New Roman" w:eastAsia="Times New Roman" w:hAnsi="Times New Roman"/>
-          <w:b w:val="1"/>
-          <w:bCs w:val="1"/>
           <w:sz w:val="24"/>
           <w:szCs w:val="24"/>
           <w:rtl w:val="0"/>
@@ -4210,7 +4246,7 @@
           <w:szCs w:val="24"/>
           <w:rtl w:val="0"/>
         </w:rPr>
-        <w:t xml:space="preserve"> SSD para la persistencia de datos de MySQL, logs de transacciones e historiales de búsqueda.</w:t>
+        <w:t xml:space="preserve"> Unidad SSD para garantizar la eficiencia en la persistencia de datos de MySQL, logs de transacciones e historiales de búsqueda.</w:t>
       </w:r>
     </w:p>
     <w:p>
@@ -4383,7 +4419,7 @@
           <w:szCs w:val="24"/>
           <w:rtl w:val="0"/>
         </w:rPr>
-        <w:t xml:space="preserve"> Integración con la Google Books API para la recuperación automatizada de metadatos bibliográficos. </w:t>
+        <w:t xml:space="preserve"> Integración multicanal con Alpha Cloud, E-Libro y la base de datos local de la UPT para la recuperación y unificación automatizada de recursos bibliográficos.</w:t>
       </w:r>
     </w:p>
     <w:p>
@@ -4590,7 +4626,7 @@
       <w:pPr>
         <w:numPr>
           <w:ilvl w:val="0"/>
-          <w:numId w:val="9"/>
+          <w:numId w:val="1"/>
         </w:numPr>
         <w:spacing w:after="0" w:afterAutospacing="0" w:line="360" w:lineRule="auto"/>
         <w:ind w:left="720" w:hanging="360"/>
@@ -4608,23 +4644,23 @@
           <w:szCs w:val="24"/>
           <w:rtl w:val="0"/>
         </w:rPr>
-        <w:t xml:space="preserve">Dominio del Stack Tecnológico</w:t>
-      </w:r>
-      <w:r>
-        <w:rPr>
-          <w:rFonts w:ascii="Times New Roman" w:cs="Times New Roman" w:eastAsia="Times New Roman" w:hAnsi="Times New Roman"/>
-          <w:sz w:val="24"/>
-          <w:szCs w:val="24"/>
-          <w:rtl w:val="0"/>
-        </w:rPr>
-        <w:t xml:space="preserve">: El equipo posee experiencia en el desarrollo web con PHP 8.2.12 y el uso de Visual Studio Code, facilitando la creación de una lógica de negocio distribuida para la búsqueda de recursos.</w:t>
+        <w:t xml:space="preserve">Dominio del Stack Tecnológico:</w:t>
+      </w:r>
+      <w:r>
+        <w:rPr>
+          <w:rFonts w:ascii="Times New Roman" w:cs="Times New Roman" w:eastAsia="Times New Roman" w:hAnsi="Times New Roman"/>
+          <w:sz w:val="24"/>
+          <w:szCs w:val="24"/>
+          <w:rtl w:val="0"/>
+        </w:rPr>
+        <w:t xml:space="preserve"> El equipo posee experiencia en el desarrollo web con PHP 8.2.12 y el uso de Visual Studio Code, facilitando la creación de una lógica de negocio distribuida para la búsqueda de recursos.</w:t>
       </w:r>
     </w:p>
     <w:p>
       <w:pPr>
         <w:numPr>
           <w:ilvl w:val="0"/>
-          <w:numId w:val="9"/>
+          <w:numId w:val="1"/>
         </w:numPr>
         <w:spacing w:after="0" w:afterAutospacing="0" w:line="360" w:lineRule="auto"/>
         <w:ind w:left="720" w:hanging="360"/>
@@ -4642,23 +4678,23 @@
           <w:szCs w:val="24"/>
           <w:rtl w:val="0"/>
         </w:rPr>
-        <w:t xml:space="preserve">Arquitectura de Microservicios</w:t>
-      </w:r>
-      <w:r>
-        <w:rPr>
-          <w:rFonts w:ascii="Times New Roman" w:cs="Times New Roman" w:eastAsia="Times New Roman" w:hAnsi="Times New Roman"/>
-          <w:sz w:val="24"/>
-          <w:szCs w:val="24"/>
-          <w:rtl w:val="0"/>
-        </w:rPr>
-        <w:t xml:space="preserve">: Se implementará una estructura que separa la lógica de presentación del servicio de unificación de datos, integrando microservicios externos como la Google Books API para asegurar un procesamiento eficiente de consultas híbridas</w:t>
+        <w:t xml:space="preserve">Arquitectura de Microservicios:</w:t>
+      </w:r>
+      <w:r>
+        <w:rPr>
+          <w:rFonts w:ascii="Times New Roman" w:cs="Times New Roman" w:eastAsia="Times New Roman" w:hAnsi="Times New Roman"/>
+          <w:sz w:val="24"/>
+          <w:szCs w:val="24"/>
+          <w:rtl w:val="0"/>
+        </w:rPr>
+        <w:t xml:space="preserve"> Se implementará una estructura que unifica el acceso a Alpha Cloud, E-Libro y la base de datos local de la UPT, asegurando un procesamiento eficiente de consultas híbridas mediante microservicios que integran estos catálogos de manera transparente.</w:t>
       </w:r>
     </w:p>
     <w:p>
       <w:pPr>
         <w:numPr>
           <w:ilvl w:val="0"/>
-          <w:numId w:val="9"/>
+          <w:numId w:val="1"/>
         </w:numPr>
         <w:spacing w:after="0" w:afterAutospacing="0" w:line="360" w:lineRule="auto"/>
         <w:ind w:left="720" w:hanging="360"/>
@@ -4676,23 +4712,23 @@
           <w:szCs w:val="24"/>
           <w:rtl w:val="0"/>
         </w:rPr>
-        <w:t xml:space="preserve">Gestión de Base de Datos</w:t>
-      </w:r>
-      <w:r>
-        <w:rPr>
-          <w:rFonts w:ascii="Times New Roman" w:cs="Times New Roman" w:eastAsia="Times New Roman" w:hAnsi="Times New Roman"/>
-          <w:sz w:val="24"/>
-          <w:szCs w:val="24"/>
-          <w:rtl w:val="0"/>
-        </w:rPr>
-        <w:t xml:space="preserve">: Se utilizará MySQL (gestionado mediante HeidiSQL) para la administración de inventarios locales, asegurando una integración fluida con los servicios de Azure Database for MySQL para la persistencia en la nube.</w:t>
+        <w:t xml:space="preserve">Gestión de Base de Datos:</w:t>
+      </w:r>
+      <w:r>
+        <w:rPr>
+          <w:rFonts w:ascii="Times New Roman" w:cs="Times New Roman" w:eastAsia="Times New Roman" w:hAnsi="Times New Roman"/>
+          <w:sz w:val="24"/>
+          <w:szCs w:val="24"/>
+          <w:rtl w:val="0"/>
+        </w:rPr>
+        <w:t xml:space="preserve"> Se utilizará MySQL (gestionado mediante HeidiSQL) para la administración de inventarios locales, asegurando una integración fluida con los servicios de Azure Database for MySQL para la persistencia en la nube.</w:t>
       </w:r>
     </w:p>
     <w:p>
       <w:pPr>
         <w:numPr>
           <w:ilvl w:val="0"/>
-          <w:numId w:val="9"/>
+          <w:numId w:val="1"/>
         </w:numPr>
         <w:spacing w:after="0" w:afterAutospacing="0" w:line="360" w:lineRule="auto"/>
         <w:ind w:left="720" w:hanging="360"/>
@@ -4710,23 +4746,23 @@
           <w:szCs w:val="24"/>
           <w:rtl w:val="0"/>
         </w:rPr>
-        <w:t xml:space="preserve">Infraestructura y Automatización</w:t>
-      </w:r>
-      <w:r>
-        <w:rPr>
-          <w:rFonts w:ascii="Times New Roman" w:cs="Times New Roman" w:eastAsia="Times New Roman" w:hAnsi="Times New Roman"/>
-          <w:sz w:val="24"/>
-          <w:szCs w:val="24"/>
-          <w:rtl w:val="0"/>
-        </w:rPr>
-        <w:t xml:space="preserve">: El uso de Microsoft Azure proporciona la escalabilidad necesaria para el almacenamiento de archivos, mientras que Terraform permite gestionar dicha infraestructura mediante código, minimizando errores de configuración manual.</w:t>
+        <w:t xml:space="preserve">Infraestructura y Automatización:</w:t>
+      </w:r>
+      <w:r>
+        <w:rPr>
+          <w:rFonts w:ascii="Times New Roman" w:cs="Times New Roman" w:eastAsia="Times New Roman" w:hAnsi="Times New Roman"/>
+          <w:sz w:val="24"/>
+          <w:szCs w:val="24"/>
+          <w:rtl w:val="0"/>
+        </w:rPr>
+        <w:t xml:space="preserve"> El uso de Microsoft Azure proporciona la escalabilidad necesaria para el almacenamiento de archivos, mientras que Terraform permite gestionar dicha infraestructura mediante código, minimizando errores de configuración manual.</w:t>
       </w:r>
     </w:p>
     <w:p>
       <w:pPr>
         <w:numPr>
           <w:ilvl w:val="0"/>
-          <w:numId w:val="9"/>
+          <w:numId w:val="1"/>
         </w:numPr>
         <w:spacing w:after="240" w:line="360" w:lineRule="auto"/>
         <w:ind w:left="720" w:hanging="360"/>
@@ -4744,16 +4780,16 @@
           <w:szCs w:val="24"/>
           <w:rtl w:val="0"/>
         </w:rPr>
-        <w:t xml:space="preserve">Control de Versiones y Calidad</w:t>
-      </w:r>
-      <w:r>
-        <w:rPr>
-          <w:rFonts w:ascii="Times New Roman" w:cs="Times New Roman" w:eastAsia="Times New Roman" w:hAnsi="Times New Roman"/>
-          <w:sz w:val="24"/>
-          <w:szCs w:val="24"/>
-          <w:rtl w:val="0"/>
-        </w:rPr>
-        <w:t xml:space="preserve">: La integración con GitHub permite un seguimiento riguroso del avance del proyecto y facilita la implementación de pruebas de aseguramiento de calidad (QA) en cada componente del sistema distribuido.</w:t>
+        <w:t xml:space="preserve">Control de Versiones y Calidad:</w:t>
+      </w:r>
+      <w:r>
+        <w:rPr>
+          <w:rFonts w:ascii="Times New Roman" w:cs="Times New Roman" w:eastAsia="Times New Roman" w:hAnsi="Times New Roman"/>
+          <w:sz w:val="24"/>
+          <w:szCs w:val="24"/>
+          <w:rtl w:val="0"/>
+        </w:rPr>
+        <w:t xml:space="preserve"> La integración con GitHub permite un seguimiento riguroso del avance del proyecto y facilita la implementación de pruebas de aseguramiento de calidad (QA) en cada componente del sistema distribuido.</w:t>
       </w:r>
     </w:p>
     <w:p>
@@ -4817,70 +4853,6 @@
           <w:rtl w:val="0"/>
         </w:rPr>
         <w:t xml:space="preserve">Este apartado evalúa la inversión necesaria para el desarrollo y puesta en marcha del sistema, asegurando que los recursos financieros sean utilizados de manera eficiente.</w:t>
-      </w:r>
-    </w:p>
-    <w:p>
-      <w:pPr>
-        <w:spacing w:line="360" w:lineRule="auto"/>
-        <w:jc w:val="both"/>
-        <w:rPr>
-          <w:rFonts w:ascii="Times New Roman" w:cs="Times New Roman" w:eastAsia="Times New Roman" w:hAnsi="Times New Roman"/>
-          <w:sz w:val="24"/>
-          <w:szCs w:val="24"/>
-        </w:rPr>
-      </w:pPr>
-      <w:r>
-        <w:rPr>
-          <w:rtl w:val="0"/>
-        </w:rPr>
-      </w:r>
-    </w:p>
-    <w:p>
-      <w:pPr>
-        <w:spacing w:line="360" w:lineRule="auto"/>
-        <w:jc w:val="both"/>
-        <w:rPr>
-          <w:rFonts w:ascii="Times New Roman" w:cs="Times New Roman" w:eastAsia="Times New Roman" w:hAnsi="Times New Roman"/>
-          <w:sz w:val="24"/>
-          <w:szCs w:val="24"/>
-        </w:rPr>
-      </w:pPr>
-      <w:r>
-        <w:rPr>
-          <w:rtl w:val="0"/>
-        </w:rPr>
-      </w:r>
-    </w:p>
-    <w:p>
-      <w:pPr>
-        <w:spacing w:line="360" w:lineRule="auto"/>
-        <w:jc w:val="both"/>
-        <w:rPr>
-          <w:rFonts w:ascii="Times New Roman" w:cs="Times New Roman" w:eastAsia="Times New Roman" w:hAnsi="Times New Roman"/>
-          <w:sz w:val="24"/>
-          <w:szCs w:val="24"/>
-        </w:rPr>
-      </w:pPr>
-      <w:r>
-        <w:rPr>
-          <w:rtl w:val="0"/>
-        </w:rPr>
-      </w:r>
-    </w:p>
-    <w:p>
-      <w:pPr>
-        <w:spacing w:line="360" w:lineRule="auto"/>
-        <w:jc w:val="both"/>
-        <w:rPr>
-          <w:rFonts w:ascii="Times New Roman" w:cs="Times New Roman" w:eastAsia="Times New Roman" w:hAnsi="Times New Roman"/>
-          <w:sz w:val="24"/>
-          <w:szCs w:val="24"/>
-        </w:rPr>
-      </w:pPr>
-      <w:r>
-        <w:rPr>
-          <w:rtl w:val="0"/>
-        </w:rPr>
       </w:r>
     </w:p>
     <w:p>
@@ -5999,7 +5971,7 @@
     <w:sdt>
       <w:sdtPr>
         <w:lock w:val="contentLocked"/>
-        <w:id w:val="-515644602"/>
+        <w:id w:val="-1905174617"/>
         <w:tag w:val="goog_rdk_0"/>
       </w:sdtPr>
       <w:sdtContent>
@@ -7021,61 +6993,9 @@
     </w:p>
     <w:p>
       <w:pPr>
-        <w:spacing w:after="0" w:line="360" w:lineRule="auto"/>
-        <w:jc w:val="both"/>
-        <w:rPr>
-          <w:rFonts w:ascii="Times New Roman" w:cs="Times New Roman" w:eastAsia="Times New Roman" w:hAnsi="Times New Roman"/>
-          <w:sz w:val="24"/>
-          <w:szCs w:val="24"/>
-        </w:rPr>
-      </w:pPr>
-      <w:r>
-        <w:rPr>
-          <w:rtl w:val="0"/>
-        </w:rPr>
-      </w:r>
-    </w:p>
-    <w:p>
-      <w:pPr>
-        <w:spacing w:after="0" w:line="360" w:lineRule="auto"/>
-        <w:jc w:val="both"/>
-        <w:rPr>
-          <w:rFonts w:ascii="Times New Roman" w:cs="Times New Roman" w:eastAsia="Times New Roman" w:hAnsi="Times New Roman"/>
-          <w:sz w:val="24"/>
-          <w:szCs w:val="24"/>
-        </w:rPr>
-      </w:pPr>
-      <w:r>
-        <w:rPr>
-          <w:rtl w:val="0"/>
-        </w:rPr>
-      </w:r>
-    </w:p>
-    <w:p>
-      <w:pPr>
-        <w:spacing w:after="0" w:line="360" w:lineRule="auto"/>
-        <w:jc w:val="both"/>
-        <w:rPr>
-          <w:rFonts w:ascii="Times New Roman" w:cs="Times New Roman" w:eastAsia="Times New Roman" w:hAnsi="Times New Roman"/>
-          <w:sz w:val="24"/>
-          <w:szCs w:val="24"/>
-        </w:rPr>
-      </w:pPr>
-      <w:r>
-        <w:rPr>
-          <w:rtl w:val="0"/>
-        </w:rPr>
-      </w:r>
-    </w:p>
-    <w:p>
-      <w:pPr>
         <w:pStyle w:val="Heading3"/>
-        <w:numPr>
-          <w:ilvl w:val="2"/>
-          <w:numId w:val="3"/>
-        </w:numPr>
         <w:spacing w:after="0" w:before="0" w:line="360" w:lineRule="auto"/>
-        <w:ind w:left="720" w:hanging="720"/>
+        <w:ind w:left="0" w:firstLine="0"/>
         <w:jc w:val="both"/>
         <w:rPr>
           <w:rFonts w:ascii="Times New Roman" w:cs="Times New Roman" w:eastAsia="Times New Roman" w:hAnsi="Times New Roman"/>
@@ -7092,7 +7012,7 @@
           <w:szCs w:val="24"/>
           <w:rtl w:val="0"/>
         </w:rPr>
-        <w:t xml:space="preserve">Costos generales de Administración</w:t>
+        <w:t xml:space="preserve">4.2.3 Costos generales de Administración</w:t>
       </w:r>
     </w:p>
     <w:p>
@@ -7151,7 +7071,7 @@
     <w:sdt>
       <w:sdtPr>
         <w:lock w:val="contentLocked"/>
-        <w:id w:val="-1830063938"/>
+        <w:id w:val="-1863281769"/>
         <w:tag w:val="goog_rdk_1"/>
       </w:sdtPr>
       <w:sdtContent>
@@ -8201,7 +8121,7 @@
     <w:sdt>
       <w:sdtPr>
         <w:lock w:val="contentLocked"/>
-        <w:id w:val="1760445672"/>
+        <w:id w:val="-447491909"/>
         <w:tag w:val="goog_rdk_2"/>
       </w:sdtPr>
       <w:sdtContent>
@@ -8895,7 +8815,7 @@
           <w:szCs w:val="24"/>
           <w:rtl w:val="0"/>
         </w:rPr>
-        <w:t xml:space="preserve">El desarrollo e implementación del sistema se encuentra estrictamente dentro del marco legal vigente. La plataforma no infringe derechos de propiedad intelectual, ya que emplea tecnologías de libre uso y de código abierto, como el motor MySQL y el lenguaje PHP. Asimismo, la integración con la Google Books API se realiza bajo sus términos de servicio para fines académicos, asegurando el respeto a la autoría y los metadatos bibliográficos.</w:t>
+        <w:t xml:space="preserve">El desarrollo e implementación del sistema se encuentra estrictamente dentro del marco legal vigente. La plataforma no infringe derechos de propiedad intelectual, ya que emplea tecnologías de libre uso y de código abierto, como el motor MySQL y el lenguaje PHP. Asimismo, la integración con las plataformas Alpha Cloud y E-Libro se realiza bajo sus términos de servicio para fines académicos, asegurando el respeto a la autoría y la correcta gestión de los metadatos bibliográficos.  </w:t>
       </w:r>
     </w:p>
     <w:p>
@@ -8915,7 +8835,7 @@
           <w:szCs w:val="24"/>
           <w:rtl w:val="0"/>
         </w:rPr>
-        <w:t xml:space="preserve">El sistema funciona como un facilitador de acceso a la información mediante el redireccionamiento a repositorios públicos y recursos de consulta académica, sin incurrir en el almacenamiento no autorizado de obras protegidas. Al ser una plataforma de acceso abierto y sin registro de usuarios, se elimina la necesidad de gestionar datos sensibles o personales, simplificando el cumplimiento de las normativas de privacidad y seguridad exigidas por la facultad.</w:t>
+        <w:t xml:space="preserve">El sistema funciona como un facilitador de acceso a la información mediante el redireccionamiento a repositorios validados y recursos de consulta académica, sin incurrir en el almacenamiento no autorizado de obras protegidas. Al ser una plataforma de acceso abierto y sin registro de usuarios, se elimina la necesidad de gestionar datos sensibles o personales, lo que simplifica significativamente el cumplimiento de las normativas de privacidad y seguridad exigidas por la facultad.</w:t>
       </w:r>
     </w:p>
     <w:p>
@@ -9258,57 +9178,6 @@
           <w:rtl w:val="0"/>
         </w:rPr>
         <w:t xml:space="preserve">: La automatización de la disponibilidad de libros y acceso a PDFs libera la carga administrativa del personal bibliotecario, permitiendo una mejor distribución del talento humano en tareas de asesoría académica.</w:t>
-      </w:r>
-    </w:p>
-    <w:p>
-      <w:pPr>
-        <w:spacing w:after="0" w:line="360" w:lineRule="auto"/>
-        <w:ind w:left="2880" w:firstLine="0"/>
-        <w:jc w:val="both"/>
-        <w:rPr>
-          <w:rFonts w:ascii="Times New Roman" w:cs="Times New Roman" w:eastAsia="Times New Roman" w:hAnsi="Times New Roman"/>
-          <w:sz w:val="24"/>
-          <w:szCs w:val="24"/>
-        </w:rPr>
-      </w:pPr>
-      <w:r>
-        <w:rPr>
-          <w:rtl w:val="0"/>
-        </w:rPr>
-      </w:r>
-    </w:p>
-    <w:p>
-      <w:pPr>
-        <w:spacing w:after="0" w:line="360" w:lineRule="auto"/>
-        <w:ind w:left="2880" w:firstLine="0"/>
-        <w:jc w:val="both"/>
-        <w:rPr>
-          <w:rFonts w:ascii="Times New Roman" w:cs="Times New Roman" w:eastAsia="Times New Roman" w:hAnsi="Times New Roman"/>
-          <w:sz w:val="24"/>
-          <w:szCs w:val="24"/>
-        </w:rPr>
-      </w:pPr>
-      <w:r>
-        <w:rPr>
-          <w:rtl w:val="0"/>
-        </w:rPr>
-      </w:r>
-    </w:p>
-    <w:p>
-      <w:pPr>
-        <w:spacing w:after="0" w:line="360" w:lineRule="auto"/>
-        <w:ind w:left="2880" w:firstLine="0"/>
-        <w:jc w:val="both"/>
-        <w:rPr>
-          <w:rFonts w:ascii="Times New Roman" w:cs="Times New Roman" w:eastAsia="Times New Roman" w:hAnsi="Times New Roman"/>
-          <w:sz w:val="24"/>
-          <w:szCs w:val="24"/>
-        </w:rPr>
-      </w:pPr>
-      <w:r>
-        <w:rPr>
-          <w:rtl w:val="0"/>
-        </w:rPr>
       </w:r>
     </w:p>
     <w:p>
@@ -9848,7 +9717,7 @@
     <w:sdt>
       <w:sdtPr>
         <w:lock w:val="contentLocked"/>
-        <w:id w:val="-31421171"/>
+        <w:id w:val="-713242134"/>
         <w:tag w:val="goog_rdk_3"/>
       </w:sdtPr>
       <w:sdtContent>
@@ -9968,6 +9837,7 @@
     <w:p>
       <w:pPr>
         <w:spacing w:after="0" w:line="360" w:lineRule="auto"/>
+        <w:jc w:val="both"/>
         <w:rPr>
           <w:rFonts w:ascii="Times New Roman" w:cs="Times New Roman" w:eastAsia="Times New Roman" w:hAnsi="Times New Roman"/>
           <w:sz w:val="24"/>
@@ -10021,7 +9891,7 @@
     <w:sdt>
       <w:sdtPr>
         <w:lock w:val="contentLocked"/>
-        <w:id w:val="830719468"/>
+        <w:id w:val="-827728365"/>
         <w:tag w:val="goog_rdk_4"/>
       </w:sdtPr>
       <w:sdtContent>
@@ -10143,6 +10013,7 @@
     <w:p>
       <w:pPr>
         <w:spacing w:after="0" w:line="360" w:lineRule="auto"/>
+        <w:jc w:val="both"/>
         <w:rPr>
           <w:rFonts w:ascii="Times New Roman" w:cs="Times New Roman" w:eastAsia="Times New Roman" w:hAnsi="Times New Roman"/>
           <w:sz w:val="24"/>
@@ -10179,7 +10050,7 @@
     <w:sdt>
       <w:sdtPr>
         <w:lock w:val="contentLocked"/>
-        <w:id w:val="-196971844"/>
+        <w:id w:val="-1600783035"/>
         <w:tag w:val="goog_rdk_5"/>
       </w:sdtPr>
       <w:sdtContent>
@@ -10301,6 +10172,7 @@
     <w:p>
       <w:pPr>
         <w:spacing w:line="360" w:lineRule="auto"/>
+        <w:jc w:val="both"/>
         <w:rPr>
           <w:rFonts w:ascii="Times New Roman" w:cs="Times New Roman" w:eastAsia="Times New Roman" w:hAnsi="Times New Roman"/>
           <w:sz w:val="24"/>
@@ -10350,65 +10222,65 @@
       <w:pPr>
         <w:numPr>
           <w:ilvl w:val="0"/>
-          <w:numId w:val="10"/>
+          <w:numId w:val="9"/>
         </w:numPr>
         <w:spacing w:after="0" w:afterAutospacing="0" w:line="360" w:lineRule="auto"/>
         <w:ind w:left="720" w:hanging="360"/>
-        <w:rPr>
-          <w:rFonts w:ascii="Times New Roman" w:cs="Times New Roman" w:eastAsia="Times New Roman" w:hAnsi="Times New Roman"/>
-          <w:sz w:val="24"/>
-          <w:szCs w:val="24"/>
-          <w:u w:val="none"/>
-        </w:rPr>
-      </w:pPr>
-      <w:r>
-        <w:rPr>
-          <w:rFonts w:ascii="Times New Roman" w:cs="Times New Roman" w:eastAsia="Times New Roman" w:hAnsi="Times New Roman"/>
-          <w:sz w:val="24"/>
-          <w:szCs w:val="24"/>
-          <w:rtl w:val="0"/>
-        </w:rPr>
-        <w:t xml:space="preserve">El proyecto del Sistema de Buscador Unificado demuestra ser factible en todos los aspectos evaluados: técnico, económico, operativo, legal, social y ambiental.</w:t>
+        <w:jc w:val="both"/>
+        <w:rPr>
+          <w:rFonts w:ascii="Times New Roman" w:cs="Times New Roman" w:eastAsia="Times New Roman" w:hAnsi="Times New Roman"/>
+          <w:sz w:val="24"/>
+          <w:szCs w:val="24"/>
+        </w:rPr>
+      </w:pPr>
+      <w:r>
+        <w:rPr>
+          <w:rFonts w:ascii="Times New Roman" w:cs="Times New Roman" w:eastAsia="Times New Roman" w:hAnsi="Times New Roman"/>
+          <w:sz w:val="24"/>
+          <w:szCs w:val="24"/>
+          <w:rtl w:val="0"/>
+        </w:rPr>
+        <w:t xml:space="preserve">El proyecto del Sistema NexusLib demuestra ser plenamente factible en todos los aspectos evaluados: técnico, económico, operativo, legal, social y ambiental.</w:t>
       </w:r>
     </w:p>
     <w:p>
       <w:pPr>
         <w:numPr>
           <w:ilvl w:val="0"/>
-          <w:numId w:val="10"/>
+          <w:numId w:val="9"/>
         </w:numPr>
         <w:spacing w:after="0" w:afterAutospacing="0" w:line="360" w:lineRule="auto"/>
         <w:ind w:left="720" w:hanging="360"/>
-        <w:rPr>
-          <w:rFonts w:ascii="Times New Roman" w:cs="Times New Roman" w:eastAsia="Times New Roman" w:hAnsi="Times New Roman"/>
-          <w:sz w:val="24"/>
-          <w:szCs w:val="24"/>
-          <w:u w:val="none"/>
-        </w:rPr>
-      </w:pPr>
-      <w:r>
-        <w:rPr>
-          <w:rFonts w:ascii="Times New Roman" w:cs="Times New Roman" w:eastAsia="Times New Roman" w:hAnsi="Times New Roman"/>
-          <w:sz w:val="24"/>
-          <w:szCs w:val="24"/>
-          <w:rtl w:val="0"/>
-        </w:rPr>
-        <w:t xml:space="preserve">La propuesta tecnológica basada en una arquitectura de microservicios e integración de APIs externas, utilizando PHP 8.2.12, MySQL e infraestructura en Azure, garantiza una solución robusta y escalable para la gestión de recursos bibliográficos.</w:t>
+        <w:jc w:val="both"/>
+        <w:rPr>
+          <w:rFonts w:ascii="Times New Roman" w:cs="Times New Roman" w:eastAsia="Times New Roman" w:hAnsi="Times New Roman"/>
+          <w:sz w:val="24"/>
+          <w:szCs w:val="24"/>
+        </w:rPr>
+      </w:pPr>
+      <w:r>
+        <w:rPr>
+          <w:rFonts w:ascii="Times New Roman" w:cs="Times New Roman" w:eastAsia="Times New Roman" w:hAnsi="Times New Roman"/>
+          <w:sz w:val="24"/>
+          <w:szCs w:val="24"/>
+          <w:rtl w:val="0"/>
+        </w:rPr>
+        <w:t xml:space="preserve">La propuesta tecnológica, basada en una arquitectura de microservicios que integra de manera unificada la base de datos local de la UPT, Alpha Cloud y E-Libro, garantiza una solución robusta y escalable empleando PHP 8.2.12, MySQL e infraestructura en Azure.</w:t>
       </w:r>
     </w:p>
     <w:p>
       <w:pPr>
         <w:numPr>
           <w:ilvl w:val="0"/>
-          <w:numId w:val="10"/>
+          <w:numId w:val="9"/>
         </w:numPr>
         <w:spacing w:after="0" w:afterAutospacing="0" w:line="360" w:lineRule="auto"/>
         <w:ind w:left="720" w:hanging="360"/>
-        <w:rPr>
-          <w:rFonts w:ascii="Times New Roman" w:cs="Times New Roman" w:eastAsia="Times New Roman" w:hAnsi="Times New Roman"/>
-          <w:sz w:val="24"/>
-          <w:szCs w:val="24"/>
-          <w:u w:val="none"/>
+        <w:jc w:val="both"/>
+        <w:rPr>
+          <w:rFonts w:ascii="Times New Roman" w:cs="Times New Roman" w:eastAsia="Times New Roman" w:hAnsi="Times New Roman"/>
+          <w:sz w:val="24"/>
+          <w:szCs w:val="24"/>
         </w:rPr>
       </w:pPr>
       <w:r>
@@ -10425,75 +10297,75 @@
       <w:pPr>
         <w:numPr>
           <w:ilvl w:val="0"/>
-          <w:numId w:val="10"/>
+          <w:numId w:val="9"/>
         </w:numPr>
         <w:spacing w:after="0" w:afterAutospacing="0" w:line="360" w:lineRule="auto"/>
         <w:ind w:left="720" w:hanging="360"/>
-        <w:rPr>
-          <w:rFonts w:ascii="Times New Roman" w:cs="Times New Roman" w:eastAsia="Times New Roman" w:hAnsi="Times New Roman"/>
-          <w:sz w:val="24"/>
-          <w:szCs w:val="24"/>
-          <w:u w:val="none"/>
-        </w:rPr>
-      </w:pPr>
-      <w:r>
-        <w:rPr>
-          <w:rFonts w:ascii="Times New Roman" w:cs="Times New Roman" w:eastAsia="Times New Roman" w:hAnsi="Times New Roman"/>
-          <w:sz w:val="24"/>
-          <w:szCs w:val="24"/>
-          <w:rtl w:val="0"/>
-        </w:rPr>
-        <w:t xml:space="preserve">La optimización del presupuesto, al utilizar herramientas de código abierto como Visual Studio Code y HeidiSQL, permite una gestión eficiente de los recursos institucionales, priorizando la inversión en infraestructura de nube y talento humano.</w:t>
+        <w:jc w:val="both"/>
+        <w:rPr>
+          <w:rFonts w:ascii="Times New Roman" w:cs="Times New Roman" w:eastAsia="Times New Roman" w:hAnsi="Times New Roman"/>
+          <w:sz w:val="24"/>
+          <w:szCs w:val="24"/>
+        </w:rPr>
+      </w:pPr>
+      <w:r>
+        <w:rPr>
+          <w:rFonts w:ascii="Times New Roman" w:cs="Times New Roman" w:eastAsia="Times New Roman" w:hAnsi="Times New Roman"/>
+          <w:sz w:val="24"/>
+          <w:szCs w:val="24"/>
+          <w:rtl w:val="0"/>
+        </w:rPr>
+        <w:t xml:space="preserve">La optimización del presupuesto, al utilizar herramientas de código abierto como Visual Studio Code y HeidiSQL, permite una gestión eficiente de los recursos institucionales, priorizando la inversión en infraestructura de nube gestionada por Terraform y el talento humano.</w:t>
       </w:r>
     </w:p>
     <w:p>
       <w:pPr>
         <w:numPr>
           <w:ilvl w:val="0"/>
-          <w:numId w:val="10"/>
+          <w:numId w:val="9"/>
         </w:numPr>
         <w:spacing w:after="0" w:afterAutospacing="0" w:line="360" w:lineRule="auto"/>
         <w:ind w:left="720" w:hanging="360"/>
-        <w:rPr>
-          <w:rFonts w:ascii="Times New Roman" w:cs="Times New Roman" w:eastAsia="Times New Roman" w:hAnsi="Times New Roman"/>
-          <w:sz w:val="24"/>
-          <w:szCs w:val="24"/>
-          <w:u w:val="none"/>
-        </w:rPr>
-      </w:pPr>
-      <w:r>
-        <w:rPr>
-          <w:rFonts w:ascii="Times New Roman" w:cs="Times New Roman" w:eastAsia="Times New Roman" w:hAnsi="Times New Roman"/>
-          <w:sz w:val="24"/>
-          <w:szCs w:val="24"/>
-          <w:rtl w:val="0"/>
-        </w:rPr>
-        <w:t xml:space="preserve">El sistema representa una oportunidad real de modernización académica, permitiendo a estudiantes y docentes acceder de manera eficiente a la totalidad de la oferta bibliográfica de la institución mediante la unificación de catálogos físicos y digitales.</w:t>
+        <w:jc w:val="both"/>
+        <w:rPr>
+          <w:rFonts w:ascii="Times New Roman" w:cs="Times New Roman" w:eastAsia="Times New Roman" w:hAnsi="Times New Roman"/>
+          <w:sz w:val="24"/>
+          <w:szCs w:val="24"/>
+        </w:rPr>
+      </w:pPr>
+      <w:r>
+        <w:rPr>
+          <w:rFonts w:ascii="Times New Roman" w:cs="Times New Roman" w:eastAsia="Times New Roman" w:hAnsi="Times New Roman"/>
+          <w:sz w:val="24"/>
+          <w:szCs w:val="24"/>
+          <w:rtl w:val="0"/>
+        </w:rPr>
+        <w:t xml:space="preserve">El sistema representa una oportunidad real de modernización académica, permitiendo a estudiantes y docentes acceder de manera eficiente a la totalidad de la oferta bibliográfica de la institución mediante la unificación de catálogos físicos y digitales en una sola interfaz.</w:t>
       </w:r>
     </w:p>
     <w:p>
       <w:pPr>
         <w:numPr>
           <w:ilvl w:val="0"/>
-          <w:numId w:val="10"/>
+          <w:numId w:val="9"/>
         </w:numPr>
         <w:spacing w:after="240" w:line="360" w:lineRule="auto"/>
         <w:ind w:left="720" w:hanging="360"/>
-        <w:rPr>
-          <w:rFonts w:ascii="Times New Roman" w:cs="Times New Roman" w:eastAsia="Times New Roman" w:hAnsi="Times New Roman"/>
-          <w:sz w:val="24"/>
-          <w:szCs w:val="24"/>
-          <w:u w:val="none"/>
-        </w:rPr>
-      </w:pPr>
-      <w:r>
-        <w:rPr>
-          <w:rFonts w:ascii="Times New Roman" w:cs="Times New Roman" w:eastAsia="Times New Roman" w:hAnsi="Times New Roman"/>
-          <w:sz w:val="24"/>
-          <w:szCs w:val="24"/>
-          <w:rtl w:val="0"/>
-        </w:rPr>
-        <w:t xml:space="preserve">En conjunto, el proyecto se presenta como una solución sólida con un alto impacto social y educativo, alineado con las metas de transformación digital de la facultad y las exigencias técnicas actuales.</w:t>
+        <w:jc w:val="both"/>
+        <w:rPr>
+          <w:rFonts w:ascii="Times New Roman" w:cs="Times New Roman" w:eastAsia="Times New Roman" w:hAnsi="Times New Roman"/>
+          <w:sz w:val="24"/>
+          <w:szCs w:val="24"/>
+        </w:rPr>
+      </w:pPr>
+      <w:r>
+        <w:rPr>
+          <w:rFonts w:ascii="Times New Roman" w:cs="Times New Roman" w:eastAsia="Times New Roman" w:hAnsi="Times New Roman"/>
+          <w:sz w:val="24"/>
+          <w:szCs w:val="24"/>
+          <w:rtl w:val="0"/>
+        </w:rPr>
+        <w:t xml:space="preserve">En conjunto, el proyecto se presenta como una solución tecnológica sólida con un alto impacto social y educativo, alineada con las metas de transformación digital de la facultad y las exigencias técnicas actuales.</w:t>
       </w:r>
     </w:p>
     <w:sectPr>
@@ -10612,9 +10484,10 @@
       <w:lvlText w:val="●"/>
       <w:lvlJc w:val="left"/>
       <w:pPr>
-        <w:ind w:left="2160" w:hanging="360"/>
+        <w:ind w:left="720" w:hanging="360"/>
       </w:pPr>
       <w:rPr>
+        <w:rFonts w:ascii="Arial" w:cs="Arial" w:eastAsia="Arial" w:hAnsi="Arial"/>
         <w:u w:val="none"/>
       </w:rPr>
     </w:lvl>
@@ -10624,7 +10497,7 @@
       <w:lvlText w:val="○"/>
       <w:lvlJc w:val="left"/>
       <w:pPr>
-        <w:ind w:left="2880" w:hanging="360"/>
+        <w:ind w:left="1440" w:hanging="360"/>
       </w:pPr>
       <w:rPr>
         <w:u w:val="none"/>
@@ -10636,7 +10509,7 @@
       <w:lvlText w:val="■"/>
       <w:lvlJc w:val="left"/>
       <w:pPr>
-        <w:ind w:left="3600" w:hanging="360"/>
+        <w:ind w:left="2160" w:hanging="360"/>
       </w:pPr>
       <w:rPr>
         <w:u w:val="none"/>
@@ -10648,7 +10521,7 @@
       <w:lvlText w:val="●"/>
       <w:lvlJc w:val="left"/>
       <w:pPr>
-        <w:ind w:left="4320" w:hanging="360"/>
+        <w:ind w:left="2880" w:hanging="360"/>
       </w:pPr>
       <w:rPr>
         <w:u w:val="none"/>
@@ -10660,7 +10533,7 @@
       <w:lvlText w:val="○"/>
       <w:lvlJc w:val="left"/>
       <w:pPr>
-        <w:ind w:left="5040" w:hanging="360"/>
+        <w:ind w:left="3600" w:hanging="360"/>
       </w:pPr>
       <w:rPr>
         <w:u w:val="none"/>
@@ -10672,7 +10545,7 @@
       <w:lvlText w:val="■"/>
       <w:lvlJc w:val="left"/>
       <w:pPr>
-        <w:ind w:left="5760" w:hanging="360"/>
+        <w:ind w:left="4320" w:hanging="360"/>
       </w:pPr>
       <w:rPr>
         <w:u w:val="none"/>
@@ -10684,7 +10557,7 @@
       <w:lvlText w:val="●"/>
       <w:lvlJc w:val="left"/>
       <w:pPr>
-        <w:ind w:left="6480" w:hanging="360"/>
+        <w:ind w:left="5040" w:hanging="360"/>
       </w:pPr>
       <w:rPr>
         <w:u w:val="none"/>
@@ -10696,7 +10569,7 @@
       <w:lvlText w:val="○"/>
       <w:lvlJc w:val="left"/>
       <w:pPr>
-        <w:ind w:left="7200" w:hanging="360"/>
+        <w:ind w:left="5760" w:hanging="360"/>
       </w:pPr>
       <w:rPr>
         <w:u w:val="none"/>
@@ -10708,7 +10581,7 @@
       <w:lvlText w:val="■"/>
       <w:lvlJc w:val="left"/>
       <w:pPr>
-        <w:ind w:left="7920" w:hanging="360"/>
+        <w:ind w:left="6480" w:hanging="360"/>
       </w:pPr>
       <w:rPr>
         <w:u w:val="none"/>
@@ -10722,7 +10595,7 @@
       <w:lvlText w:val="●"/>
       <w:lvlJc w:val="left"/>
       <w:pPr>
-        <w:ind w:left="1080" w:hanging="360"/>
+        <w:ind w:left="2160" w:hanging="360"/>
       </w:pPr>
       <w:rPr>
         <w:u w:val="none"/>
@@ -10734,7 +10607,7 @@
       <w:lvlText w:val="○"/>
       <w:lvlJc w:val="left"/>
       <w:pPr>
-        <w:ind w:left="1800" w:hanging="360"/>
+        <w:ind w:left="2880" w:hanging="360"/>
       </w:pPr>
       <w:rPr>
         <w:u w:val="none"/>
@@ -10746,7 +10619,7 @@
       <w:lvlText w:val="■"/>
       <w:lvlJc w:val="left"/>
       <w:pPr>
-        <w:ind w:left="2520" w:hanging="360"/>
+        <w:ind w:left="3600" w:hanging="360"/>
       </w:pPr>
       <w:rPr>
         <w:u w:val="none"/>
@@ -10758,7 +10631,7 @@
       <w:lvlText w:val="●"/>
       <w:lvlJc w:val="left"/>
       <w:pPr>
-        <w:ind w:left="3240" w:hanging="360"/>
+        <w:ind w:left="4320" w:hanging="360"/>
       </w:pPr>
       <w:rPr>
         <w:u w:val="none"/>
@@ -10770,7 +10643,7 @@
       <w:lvlText w:val="○"/>
       <w:lvlJc w:val="left"/>
       <w:pPr>
-        <w:ind w:left="3960" w:hanging="360"/>
+        <w:ind w:left="5040" w:hanging="360"/>
       </w:pPr>
       <w:rPr>
         <w:u w:val="none"/>
@@ -10782,7 +10655,7 @@
       <w:lvlText w:val="■"/>
       <w:lvlJc w:val="left"/>
       <w:pPr>
-        <w:ind w:left="4680" w:hanging="360"/>
+        <w:ind w:left="5760" w:hanging="360"/>
       </w:pPr>
       <w:rPr>
         <w:u w:val="none"/>
@@ -10794,7 +10667,7 @@
       <w:lvlText w:val="●"/>
       <w:lvlJc w:val="left"/>
       <w:pPr>
-        <w:ind w:left="5400" w:hanging="360"/>
+        <w:ind w:left="6480" w:hanging="360"/>
       </w:pPr>
       <w:rPr>
         <w:u w:val="none"/>
@@ -10806,7 +10679,7 @@
       <w:lvlText w:val="○"/>
       <w:lvlJc w:val="left"/>
       <w:pPr>
-        <w:ind w:left="6120" w:hanging="360"/>
+        <w:ind w:left="7200" w:hanging="360"/>
       </w:pPr>
       <w:rPr>
         <w:u w:val="none"/>
@@ -10818,7 +10691,7 @@
       <w:lvlText w:val="■"/>
       <w:lvlJc w:val="left"/>
       <w:pPr>
-        <w:ind w:left="6840" w:hanging="360"/>
+        <w:ind w:left="7920" w:hanging="360"/>
       </w:pPr>
       <w:rPr>
         <w:u w:val="none"/>
@@ -10827,94 +10700,112 @@
   </w:abstractNum>
   <w:abstractNum w:abstractNumId="3">
     <w:lvl w:ilvl="0">
-      <w:start w:val="4"/>
-      <w:numFmt w:val="decimal"/>
-      <w:lvlText w:val="%1"/>
+      <w:start w:val="1"/>
+      <w:numFmt w:val="bullet"/>
+      <w:lvlText w:val="●"/>
       <w:lvlJc w:val="left"/>
       <w:pPr>
-        <w:ind w:left="480" w:hanging="480"/>
-      </w:pPr>
-      <w:rPr/>
+        <w:ind w:left="1080" w:hanging="360"/>
+      </w:pPr>
+      <w:rPr>
+        <w:u w:val="none"/>
+      </w:rPr>
     </w:lvl>
     <w:lvl w:ilvl="1">
-      <w:start w:val="2"/>
-      <w:numFmt w:val="decimal"/>
-      <w:lvlText w:val="%1.%2"/>
+      <w:start w:val="1"/>
+      <w:numFmt w:val="bullet"/>
+      <w:lvlText w:val="○"/>
       <w:lvlJc w:val="left"/>
       <w:pPr>
-        <w:ind w:left="480" w:hanging="480"/>
-      </w:pPr>
-      <w:rPr/>
+        <w:ind w:left="1800" w:hanging="360"/>
+      </w:pPr>
+      <w:rPr>
+        <w:u w:val="none"/>
+      </w:rPr>
     </w:lvl>
     <w:lvl w:ilvl="2">
-      <w:start w:val="3"/>
-      <w:numFmt w:val="decimal"/>
-      <w:lvlText w:val="%1.%2.%3"/>
+      <w:start w:val="1"/>
+      <w:numFmt w:val="bullet"/>
+      <w:lvlText w:val="■"/>
       <w:lvlJc w:val="left"/>
       <w:pPr>
-        <w:ind w:left="720" w:hanging="720"/>
-      </w:pPr>
-      <w:rPr/>
+        <w:ind w:left="2520" w:hanging="360"/>
+      </w:pPr>
+      <w:rPr>
+        <w:u w:val="none"/>
+      </w:rPr>
     </w:lvl>
     <w:lvl w:ilvl="3">
       <w:start w:val="1"/>
-      <w:numFmt w:val="decimal"/>
-      <w:lvlText w:val="%1.%2.%3.%4"/>
+      <w:numFmt w:val="bullet"/>
+      <w:lvlText w:val="●"/>
       <w:lvlJc w:val="left"/>
       <w:pPr>
-        <w:ind w:left="720" w:hanging="720"/>
-      </w:pPr>
-      <w:rPr/>
+        <w:ind w:left="3240" w:hanging="360"/>
+      </w:pPr>
+      <w:rPr>
+        <w:u w:val="none"/>
+      </w:rPr>
     </w:lvl>
     <w:lvl w:ilvl="4">
       <w:start w:val="1"/>
-      <w:numFmt w:val="decimal"/>
-      <w:lvlText w:val="%1.%2.%3.%4.%5"/>
+      <w:numFmt w:val="bullet"/>
+      <w:lvlText w:val="○"/>
       <w:lvlJc w:val="left"/>
       <w:pPr>
-        <w:ind w:left="1080" w:hanging="1080"/>
-      </w:pPr>
-      <w:rPr/>
+        <w:ind w:left="3960" w:hanging="360"/>
+      </w:pPr>
+      <w:rPr>
+        <w:u w:val="none"/>
+      </w:rPr>
     </w:lvl>
     <w:lvl w:ilvl="5">
       <w:start w:val="1"/>
-      <w:numFmt w:val="decimal"/>
-      <w:lvlText w:val="%1.%2.%3.%4.%5.%6"/>
+      <w:numFmt w:val="bullet"/>
+      <w:lvlText w:val="■"/>
       <w:lvlJc w:val="left"/>
       <w:pPr>
-        <w:ind w:left="1080" w:hanging="1080"/>
-      </w:pPr>
-      <w:rPr/>
+        <w:ind w:left="4680" w:hanging="360"/>
+      </w:pPr>
+      <w:rPr>
+        <w:u w:val="none"/>
+      </w:rPr>
     </w:lvl>
     <w:lvl w:ilvl="6">
       <w:start w:val="1"/>
-      <w:numFmt w:val="decimal"/>
-      <w:lvlText w:val="%1.%2.%3.%4.%5.%6.%7"/>
+      <w:numFmt w:val="bullet"/>
+      <w:lvlText w:val="●"/>
       <w:lvlJc w:val="left"/>
       <w:pPr>
-        <w:ind w:left="1440" w:hanging="1440"/>
-      </w:pPr>
-      <w:rPr/>
+        <w:ind w:left="5400" w:hanging="360"/>
+      </w:pPr>
+      <w:rPr>
+        <w:u w:val="none"/>
+      </w:rPr>
     </w:lvl>
     <w:lvl w:ilvl="7">
       <w:start w:val="1"/>
-      <w:numFmt w:val="decimal"/>
-      <w:lvlText w:val="%1.%2.%3.%4.%5.%6.%7.%8"/>
+      <w:numFmt w:val="bullet"/>
+      <w:lvlText w:val="○"/>
       <w:lvlJc w:val="left"/>
       <w:pPr>
-        <w:ind w:left="1440" w:hanging="1440"/>
-      </w:pPr>
-      <w:rPr/>
+        <w:ind w:left="6120" w:hanging="360"/>
+      </w:pPr>
+      <w:rPr>
+        <w:u w:val="none"/>
+      </w:rPr>
     </w:lvl>
     <w:lvl w:ilvl="8">
       <w:start w:val="1"/>
-      <w:numFmt w:val="decimal"/>
-      <w:lvlText w:val="%1.%2.%3.%4.%5.%6.%7.%8.%9"/>
+      <w:numFmt w:val="bullet"/>
+      <w:lvlText w:val="■"/>
       <w:lvlJc w:val="left"/>
       <w:pPr>
-        <w:ind w:left="1800" w:hanging="1800"/>
-      </w:pPr>
-      <w:rPr/>
+        <w:ind w:left="6840" w:hanging="360"/>
+      </w:pPr>
+      <w:rPr>
+        <w:u w:val="none"/>
+      </w:rPr>
     </w:lvl>
   </w:abstractNum>
   <w:abstractNum w:abstractNumId="4">
@@ -11468,117 +11359,6 @@
     </w:lvl>
   </w:abstractNum>
   <w:abstractNum w:abstractNumId="9">
-    <w:lvl w:ilvl="0">
-      <w:start w:val="1"/>
-      <w:numFmt w:val="bullet"/>
-      <w:lvlText w:val="●"/>
-      <w:lvlJc w:val="left"/>
-      <w:pPr>
-        <w:ind w:left="720" w:hanging="360"/>
-      </w:pPr>
-      <w:rPr>
-        <w:rFonts w:ascii="Arial" w:cs="Arial" w:eastAsia="Arial" w:hAnsi="Arial"/>
-        <w:u w:val="none"/>
-      </w:rPr>
-    </w:lvl>
-    <w:lvl w:ilvl="1">
-      <w:start w:val="1"/>
-      <w:numFmt w:val="bullet"/>
-      <w:lvlText w:val="○"/>
-      <w:lvlJc w:val="left"/>
-      <w:pPr>
-        <w:ind w:left="1440" w:hanging="360"/>
-      </w:pPr>
-      <w:rPr>
-        <w:u w:val="none"/>
-      </w:rPr>
-    </w:lvl>
-    <w:lvl w:ilvl="2">
-      <w:start w:val="1"/>
-      <w:numFmt w:val="bullet"/>
-      <w:lvlText w:val="■"/>
-      <w:lvlJc w:val="left"/>
-      <w:pPr>
-        <w:ind w:left="2160" w:hanging="360"/>
-      </w:pPr>
-      <w:rPr>
-        <w:u w:val="none"/>
-      </w:rPr>
-    </w:lvl>
-    <w:lvl w:ilvl="3">
-      <w:start w:val="1"/>
-      <w:numFmt w:val="bullet"/>
-      <w:lvlText w:val="●"/>
-      <w:lvlJc w:val="left"/>
-      <w:pPr>
-        <w:ind w:left="2880" w:hanging="360"/>
-      </w:pPr>
-      <w:rPr>
-        <w:u w:val="none"/>
-      </w:rPr>
-    </w:lvl>
-    <w:lvl w:ilvl="4">
-      <w:start w:val="1"/>
-      <w:numFmt w:val="bullet"/>
-      <w:lvlText w:val="○"/>
-      <w:lvlJc w:val="left"/>
-      <w:pPr>
-        <w:ind w:left="3600" w:hanging="360"/>
-      </w:pPr>
-      <w:rPr>
-        <w:u w:val="none"/>
-      </w:rPr>
-    </w:lvl>
-    <w:lvl w:ilvl="5">
-      <w:start w:val="1"/>
-      <w:numFmt w:val="bullet"/>
-      <w:lvlText w:val="■"/>
-      <w:lvlJc w:val="left"/>
-      <w:pPr>
-        <w:ind w:left="4320" w:hanging="360"/>
-      </w:pPr>
-      <w:rPr>
-        <w:u w:val="none"/>
-      </w:rPr>
-    </w:lvl>
-    <w:lvl w:ilvl="6">
-      <w:start w:val="1"/>
-      <w:numFmt w:val="bullet"/>
-      <w:lvlText w:val="●"/>
-      <w:lvlJc w:val="left"/>
-      <w:pPr>
-        <w:ind w:left="5040" w:hanging="360"/>
-      </w:pPr>
-      <w:rPr>
-        <w:u w:val="none"/>
-      </w:rPr>
-    </w:lvl>
-    <w:lvl w:ilvl="7">
-      <w:start w:val="1"/>
-      <w:numFmt w:val="bullet"/>
-      <w:lvlText w:val="○"/>
-      <w:lvlJc w:val="left"/>
-      <w:pPr>
-        <w:ind w:left="5760" w:hanging="360"/>
-      </w:pPr>
-      <w:rPr>
-        <w:u w:val="none"/>
-      </w:rPr>
-    </w:lvl>
-    <w:lvl w:ilvl="8">
-      <w:start w:val="1"/>
-      <w:numFmt w:val="bullet"/>
-      <w:lvlText w:val="■"/>
-      <w:lvlJc w:val="left"/>
-      <w:pPr>
-        <w:ind w:left="6480" w:hanging="360"/>
-      </w:pPr>
-      <w:rPr>
-        <w:u w:val="none"/>
-      </w:rPr>
-    </w:lvl>
-  </w:abstractNum>
-  <w:abstractNum w:abstractNumId="10">
     <w:lvl w:ilvl="0">
       <w:start w:val="1"/>
       <w:numFmt w:val="bullet"/>
@@ -11714,9 +11494,6 @@
   </w:num>
   <w:num w:numId="9">
     <w:abstractNumId w:val="9"/>
-  </w:num>
-  <w:num w:numId="10">
-    <w:abstractNumId w:val="10"/>
   </w:num>
 </w:numbering>
 </file>

</xml_diff>